<commit_message>
Harden loader and split, drop the flaw hints from prepare.py, and clarify exercises and lesson
</commit_message>
<xml_diff>
--- a/docs/subagents.docx
+++ b/docs/subagents.docx
@@ -2823,7 +2823,7 @@
           <w:shd w:fill="ece6dd" w:val="clear"/>
           <w:rtl w:val="0"/>
         </w:rPr>
-        <w:t xml:space="preserve">@agent code-quality-reviewer</w:t>
+        <w:t>@agent-code-quality-reviewer</w:t>
       </w:r>
       <w:r>
         <w:rPr>
@@ -2871,7 +2871,7 @@
         <w:rPr>
           <w:rtl w:val="0"/>
         </w:rPr>
-        <w:t xml:space="preserve"> Claude decides to use the subagent. Must be a single line (use </w:t>
+        <w:t xml:space="preserve"> Claude decides to use the subagent. It is a single YAML value: write it on one line (use </w:t>
       </w:r>
       <w:r>
         <w:rPr>
@@ -2888,7 +2888,7 @@
         <w:rPr>
           <w:rtl w:val="0"/>
         </w:rPr>
-        <w:t xml:space="preserve"> for breaks). You can include example conversations to clarify when delegation is appropriate.</w:t>
+        <w:t xml:space="preserve"> for breaks), or wrap long text onto indented continuation lines, as the demo configs do. You can include example conversations to clarify when delegation is appropriate.</w:t>
       </w:r>
     </w:p>
     <w:p>
@@ -8113,7 +8113,6 @@
                 <w:szCs w:val="18"/>
                 <w:rtl w:val="0"/>
               </w:rPr>
-              <w:t xml:space="preserve"> </w:t>
             </w:r>
             <w:r>
               <w:rPr>
@@ -8155,7 +8154,6 @@
                 <w:szCs w:val="18"/>
                 <w:rtl w:val="0"/>
               </w:rPr>
-              <w:t xml:space="preserve"> </w:t>
             </w:r>
             <w:r>
               <w:rPr>
@@ -8218,28 +8216,26 @@
                 <w:szCs w:val="18"/>
                 <w:rtl w:val="0"/>
               </w:rPr>
-              <w:t xml:space="preserve"> </w:t>
-            </w:r>
-            <w:r>
-              <w:rPr>
-                <w:rtl w:val="0"/>
-              </w:rPr>
-            </w:r>
-          </w:p>
-          <w:p>
-            <w:pPr>
-              <w:spacing w:after="0" w:line="360" w:lineRule="auto"/>
-              <w:jc w:val="both"/>
-              <w:rPr/>
-            </w:pPr>
-            <w:r>
-              <w:rPr>
-                <w:rFonts w:ascii="Courier New" w:cs="Courier New" w:eastAsia="Courier New" w:hAnsi="Courier New"/>
-                <w:sz w:val="18"/>
-                <w:szCs w:val="18"/>
-                <w:rtl w:val="0"/>
-              </w:rPr>
-              <w:t xml:space="preserve"> </w:t>
+            </w:r>
+            <w:r>
+              <w:rPr>
+                <w:rtl w:val="0"/>
+              </w:rPr>
+            </w:r>
+          </w:p>
+          <w:p>
+            <w:pPr>
+              <w:spacing w:after="0" w:line="360" w:lineRule="auto"/>
+              <w:jc w:val="both"/>
+              <w:rPr/>
+            </w:pPr>
+            <w:r>
+              <w:rPr>
+                <w:rFonts w:ascii="Courier New" w:cs="Courier New" w:eastAsia="Courier New" w:hAnsi="Courier New"/>
+                <w:sz w:val="18"/>
+                <w:szCs w:val="18"/>
+                <w:rtl w:val="0"/>
+              </w:rPr>
             </w:r>
             <w:r>
               <w:rPr>
@@ -8281,91 +8277,91 @@
                 <w:szCs w:val="18"/>
                 <w:rtl w:val="0"/>
               </w:rPr>
-              <w:t xml:space="preserve">    rows: list[Row],</w:t>
-            </w:r>
-            <w:r>
-              <w:rPr>
-                <w:rtl w:val="0"/>
-              </w:rPr>
-            </w:r>
-          </w:p>
-          <w:p>
-            <w:pPr>
-              <w:spacing w:after="0" w:line="360" w:lineRule="auto"/>
-              <w:jc w:val="both"/>
-              <w:rPr/>
-            </w:pPr>
-            <w:r>
-              <w:rPr>
-                <w:rFonts w:ascii="Courier New" w:cs="Courier New" w:eastAsia="Courier New" w:hAnsi="Courier New"/>
-                <w:sz w:val="18"/>
-                <w:szCs w:val="18"/>
-                <w:rtl w:val="0"/>
-              </w:rPr>
-              <w:t xml:space="preserve">    *,</w:t>
-            </w:r>
-            <w:r>
-              <w:rPr>
-                <w:rtl w:val="0"/>
-              </w:rPr>
-            </w:r>
-          </w:p>
-          <w:p>
-            <w:pPr>
-              <w:spacing w:after="0" w:line="360" w:lineRule="auto"/>
-              <w:jc w:val="both"/>
-              <w:rPr/>
-            </w:pPr>
-            <w:r>
-              <w:rPr>
-                <w:rFonts w:ascii="Courier New" w:cs="Courier New" w:eastAsia="Courier New" w:hAnsi="Courier New"/>
-                <w:sz w:val="18"/>
-                <w:szCs w:val="18"/>
-                <w:rtl w:val="0"/>
-              </w:rPr>
-              <w:t xml:space="preserve">    test_fraction: float = TEST_FRACTION,</w:t>
-            </w:r>
-            <w:r>
-              <w:rPr>
-                <w:rtl w:val="0"/>
-              </w:rPr>
-            </w:r>
-          </w:p>
-          <w:p>
-            <w:pPr>
-              <w:spacing w:after="0" w:line="360" w:lineRule="auto"/>
-              <w:jc w:val="both"/>
-              <w:rPr/>
-            </w:pPr>
-            <w:r>
-              <w:rPr>
-                <w:rFonts w:ascii="Courier New" w:cs="Courier New" w:eastAsia="Courier New" w:hAnsi="Courier New"/>
-                <w:sz w:val="18"/>
-                <w:szCs w:val="18"/>
-                <w:rtl w:val="0"/>
-              </w:rPr>
-              <w:t xml:space="preserve">    seed: int = RANDOM_SEED,</w:t>
-            </w:r>
-            <w:r>
-              <w:rPr>
-                <w:rtl w:val="0"/>
-              </w:rPr>
-            </w:r>
-          </w:p>
-          <w:p>
-            <w:pPr>
-              <w:spacing w:after="0" w:line="360" w:lineRule="auto"/>
-              <w:jc w:val="both"/>
-              <w:rPr/>
-            </w:pPr>
-            <w:r>
-              <w:rPr>
-                <w:rFonts w:ascii="Courier New" w:cs="Courier New" w:eastAsia="Courier New" w:hAnsi="Courier New"/>
-                <w:sz w:val="18"/>
-                <w:szCs w:val="18"/>
-                <w:rtl w:val="0"/>
-              </w:rPr>
-              <w:t xml:space="preserve">    label_column: str = LABEL_COLUMN,</w:t>
+              <w:t xml:space="preserve">    rows: list[Row],</w:t>
+            </w:r>
+            <w:r>
+              <w:rPr>
+                <w:rtl w:val="0"/>
+              </w:rPr>
+            </w:r>
+          </w:p>
+          <w:p>
+            <w:pPr>
+              <w:spacing w:after="0" w:line="360" w:lineRule="auto"/>
+              <w:jc w:val="both"/>
+              <w:rPr/>
+            </w:pPr>
+            <w:r>
+              <w:rPr>
+                <w:rFonts w:ascii="Courier New" w:cs="Courier New" w:eastAsia="Courier New" w:hAnsi="Courier New"/>
+                <w:sz w:val="18"/>
+                <w:szCs w:val="18"/>
+                <w:rtl w:val="0"/>
+              </w:rPr>
+              <w:t xml:space="preserve">    *,</w:t>
+            </w:r>
+            <w:r>
+              <w:rPr>
+                <w:rtl w:val="0"/>
+              </w:rPr>
+            </w:r>
+          </w:p>
+          <w:p>
+            <w:pPr>
+              <w:spacing w:after="0" w:line="360" w:lineRule="auto"/>
+              <w:jc w:val="both"/>
+              <w:rPr/>
+            </w:pPr>
+            <w:r>
+              <w:rPr>
+                <w:rFonts w:ascii="Courier New" w:cs="Courier New" w:eastAsia="Courier New" w:hAnsi="Courier New"/>
+                <w:sz w:val="18"/>
+                <w:szCs w:val="18"/>
+                <w:rtl w:val="0"/>
+              </w:rPr>
+              <w:t xml:space="preserve">    test_fraction: float = TEST_FRACTION,</w:t>
+            </w:r>
+            <w:r>
+              <w:rPr>
+                <w:rtl w:val="0"/>
+              </w:rPr>
+            </w:r>
+          </w:p>
+          <w:p>
+            <w:pPr>
+              <w:spacing w:after="0" w:line="360" w:lineRule="auto"/>
+              <w:jc w:val="both"/>
+              <w:rPr/>
+            </w:pPr>
+            <w:r>
+              <w:rPr>
+                <w:rFonts w:ascii="Courier New" w:cs="Courier New" w:eastAsia="Courier New" w:hAnsi="Courier New"/>
+                <w:sz w:val="18"/>
+                <w:szCs w:val="18"/>
+                <w:rtl w:val="0"/>
+              </w:rPr>
+              <w:t xml:space="preserve">    seed: int = RANDOM_SEED,</w:t>
+            </w:r>
+            <w:r>
+              <w:rPr>
+                <w:rtl w:val="0"/>
+              </w:rPr>
+            </w:r>
+          </w:p>
+          <w:p>
+            <w:pPr>
+              <w:spacing w:after="0" w:line="360" w:lineRule="auto"/>
+              <w:jc w:val="both"/>
+              <w:rPr/>
+            </w:pPr>
+            <w:r>
+              <w:rPr>
+                <w:rFonts w:ascii="Courier New" w:cs="Courier New" w:eastAsia="Courier New" w:hAnsi="Courier New"/>
+                <w:sz w:val="18"/>
+                <w:szCs w:val="18"/>
+                <w:rtl w:val="0"/>
+              </w:rPr>
+              <w:t xml:space="preserve">    label_column: str = LABEL_COLUMN,</w:t>
             </w:r>
             <w:r>
               <w:rPr>
@@ -8407,511 +8403,592 @@
                 <w:szCs w:val="18"/>
                 <w:rtl w:val="0"/>
               </w:rPr>
-              <w:t xml:space="preserve">    """Return (train, test) with the same label balance in both sets.</w:t>
-            </w:r>
-            <w:r>
-              <w:rPr>
-                <w:rtl w:val="0"/>
-              </w:rPr>
-            </w:r>
-          </w:p>
-          <w:p>
-            <w:pPr>
-              <w:spacing w:after="0" w:line="360" w:lineRule="auto"/>
-              <w:jc w:val="both"/>
-              <w:rPr/>
-            </w:pPr>
-            <w:r>
-              <w:rPr>
-                <w:rFonts w:ascii="Courier New" w:cs="Courier New" w:eastAsia="Courier New" w:hAnsi="Courier New"/>
-                <w:sz w:val="18"/>
-                <w:szCs w:val="18"/>
-                <w:rtl w:val="0"/>
-              </w:rPr>
-              <w:t xml:space="preserve"> </w:t>
-            </w:r>
-            <w:r>
-              <w:rPr>
-                <w:rtl w:val="0"/>
-              </w:rPr>
-            </w:r>
-          </w:p>
-          <w:p>
-            <w:pPr>
-              <w:spacing w:after="0" w:line="360" w:lineRule="auto"/>
-              <w:jc w:val="both"/>
-              <w:rPr/>
-            </w:pPr>
-            <w:r>
-              <w:rPr>
-                <w:rFonts w:ascii="Courier New" w:cs="Courier New" w:eastAsia="Courier New" w:hAnsi="Courier New"/>
-                <w:sz w:val="18"/>
-                <w:szCs w:val="18"/>
-                <w:rtl w:val="0"/>
-              </w:rPr>
-              <w:t xml:space="preserve">    Rows are grouped by label and each group is shuffled by one generator</w:t>
-            </w:r>
-            <w:r>
-              <w:rPr>
-                <w:rtl w:val="0"/>
-              </w:rPr>
-            </w:r>
-          </w:p>
-          <w:p>
-            <w:pPr>
-              <w:spacing w:after="0" w:line="360" w:lineRule="auto"/>
-              <w:jc w:val="both"/>
-              <w:rPr/>
-            </w:pPr>
-            <w:r>
-              <w:rPr>
-                <w:rFonts w:ascii="Courier New" w:cs="Courier New" w:eastAsia="Courier New" w:hAnsi="Courier New"/>
-                <w:sz w:val="18"/>
-                <w:szCs w:val="18"/>
-                <w:rtl w:val="0"/>
-              </w:rPr>
-              <w:t xml:space="preserve">    seeded with `seed`, so the same seed always produces the same split.</w:t>
-            </w:r>
-            <w:r>
-              <w:rPr>
-                <w:rtl w:val="0"/>
-              </w:rPr>
-            </w:r>
-          </w:p>
-          <w:p>
-            <w:pPr>
-              <w:spacing w:after="0" w:line="360" w:lineRule="auto"/>
-              <w:jc w:val="both"/>
-              <w:rPr/>
-            </w:pPr>
-            <w:r>
-              <w:rPr>
-                <w:rFonts w:ascii="Courier New" w:cs="Courier New" w:eastAsia="Courier New" w:hAnsi="Courier New"/>
-                <w:sz w:val="18"/>
-                <w:szCs w:val="18"/>
-                <w:rtl w:val="0"/>
-              </w:rPr>
-              <w:t xml:space="preserve">    """</w:t>
-            </w:r>
-            <w:r>
-              <w:rPr>
-                <w:rtl w:val="0"/>
-              </w:rPr>
-            </w:r>
-          </w:p>
-          <w:p>
-            <w:pPr>
-              <w:spacing w:after="0" w:line="360" w:lineRule="auto"/>
-              <w:jc w:val="both"/>
-              <w:rPr/>
-            </w:pPr>
-            <w:r>
-              <w:rPr>
-                <w:rFonts w:ascii="Courier New" w:cs="Courier New" w:eastAsia="Courier New" w:hAnsi="Courier New"/>
-                <w:sz w:val="18"/>
-                <w:szCs w:val="18"/>
-                <w:rtl w:val="0"/>
-              </w:rPr>
-              <w:t xml:space="preserve">    if not 0 &lt; test_fraction &lt; 1:</w:t>
-            </w:r>
-            <w:r>
-              <w:rPr>
-                <w:rtl w:val="0"/>
-              </w:rPr>
-            </w:r>
-          </w:p>
-          <w:p>
-            <w:pPr>
-              <w:spacing w:after="0" w:line="360" w:lineRule="auto"/>
-              <w:jc w:val="both"/>
-              <w:rPr/>
-            </w:pPr>
-            <w:r>
-              <w:rPr>
-                <w:rFonts w:ascii="Courier New" w:cs="Courier New" w:eastAsia="Courier New" w:hAnsi="Courier New"/>
-                <w:sz w:val="18"/>
-                <w:szCs w:val="18"/>
-                <w:rtl w:val="0"/>
-              </w:rPr>
-              <w:t xml:space="preserve">        raise ValueError("test_fraction must be between 0 and 1")</w:t>
-            </w:r>
-            <w:r>
-              <w:rPr>
-                <w:rtl w:val="0"/>
-              </w:rPr>
-            </w:r>
-          </w:p>
-          <w:p>
-            <w:pPr>
-              <w:spacing w:after="0" w:line="360" w:lineRule="auto"/>
-              <w:jc w:val="both"/>
-              <w:rPr/>
-            </w:pPr>
-            <w:r>
-              <w:rPr>
-                <w:rFonts w:ascii="Courier New" w:cs="Courier New" w:eastAsia="Courier New" w:hAnsi="Courier New"/>
-                <w:sz w:val="18"/>
-                <w:szCs w:val="18"/>
-                <w:rtl w:val="0"/>
-              </w:rPr>
-              <w:t xml:space="preserve"> </w:t>
-            </w:r>
-            <w:r>
-              <w:rPr>
-                <w:rtl w:val="0"/>
-              </w:rPr>
-            </w:r>
-          </w:p>
-          <w:p>
-            <w:pPr>
-              <w:spacing w:after="0" w:line="360" w:lineRule="auto"/>
-              <w:jc w:val="both"/>
-              <w:rPr/>
-            </w:pPr>
-            <w:r>
-              <w:rPr>
-                <w:rFonts w:ascii="Courier New" w:cs="Courier New" w:eastAsia="Courier New" w:hAnsi="Courier New"/>
-                <w:sz w:val="18"/>
-                <w:szCs w:val="18"/>
-                <w:rtl w:val="0"/>
-              </w:rPr>
-              <w:t xml:space="preserve">    groups: dict[float, list[Row]] = {}</w:t>
-            </w:r>
-            <w:r>
-              <w:rPr>
-                <w:rtl w:val="0"/>
-              </w:rPr>
-            </w:r>
-          </w:p>
-          <w:p>
-            <w:pPr>
-              <w:spacing w:after="0" w:line="360" w:lineRule="auto"/>
-              <w:jc w:val="both"/>
-              <w:rPr/>
-            </w:pPr>
-            <w:r>
-              <w:rPr>
-                <w:rFonts w:ascii="Courier New" w:cs="Courier New" w:eastAsia="Courier New" w:hAnsi="Courier New"/>
-                <w:sz w:val="18"/>
-                <w:szCs w:val="18"/>
-                <w:rtl w:val="0"/>
-              </w:rPr>
-              <w:t xml:space="preserve">    for row in rows:</w:t>
-            </w:r>
-            <w:r>
-              <w:rPr>
-                <w:rtl w:val="0"/>
-              </w:rPr>
-            </w:r>
-          </w:p>
-          <w:p>
-            <w:pPr>
-              <w:spacing w:after="0" w:line="360" w:lineRule="auto"/>
-              <w:jc w:val="both"/>
-              <w:rPr/>
-            </w:pPr>
-            <w:r>
-              <w:rPr>
-                <w:rFonts w:ascii="Courier New" w:cs="Courier New" w:eastAsia="Courier New" w:hAnsi="Courier New"/>
-                <w:sz w:val="18"/>
-                <w:szCs w:val="18"/>
-                <w:rtl w:val="0"/>
-              </w:rPr>
-              <w:t xml:space="preserve">        label = row[label_column]</w:t>
-            </w:r>
-            <w:r>
-              <w:rPr>
-                <w:rtl w:val="0"/>
-              </w:rPr>
-            </w:r>
-          </w:p>
-          <w:p>
-            <w:pPr>
-              <w:spacing w:after="0" w:line="360" w:lineRule="auto"/>
-              <w:jc w:val="both"/>
-              <w:rPr/>
-            </w:pPr>
-            <w:r>
-              <w:rPr>
-                <w:rFonts w:ascii="Courier New" w:cs="Courier New" w:eastAsia="Courier New" w:hAnsi="Courier New"/>
-                <w:sz w:val="18"/>
-                <w:szCs w:val="18"/>
-                <w:rtl w:val="0"/>
-              </w:rPr>
-              <w:t xml:space="preserve">        if label is None:</w:t>
-            </w:r>
-            <w:r>
-              <w:rPr>
-                <w:rtl w:val="0"/>
-              </w:rPr>
-            </w:r>
-          </w:p>
-          <w:p>
-            <w:pPr>
-              <w:spacing w:after="0" w:line="360" w:lineRule="auto"/>
-              <w:jc w:val="both"/>
-              <w:rPr/>
-            </w:pPr>
-            <w:r>
-              <w:rPr>
-                <w:rFonts w:ascii="Courier New" w:cs="Courier New" w:eastAsia="Courier New" w:hAnsi="Courier New"/>
-                <w:sz w:val="18"/>
-                <w:szCs w:val="18"/>
-                <w:rtl w:val="0"/>
-              </w:rPr>
-              <w:t xml:space="preserve">            raise ValueError(f"row has no {label_column} label")</w:t>
-            </w:r>
-            <w:r>
-              <w:rPr>
-                <w:rtl w:val="0"/>
-              </w:rPr>
-            </w:r>
-          </w:p>
-          <w:p>
-            <w:pPr>
-              <w:spacing w:after="0" w:line="360" w:lineRule="auto"/>
-              <w:jc w:val="both"/>
-              <w:rPr/>
-            </w:pPr>
-            <w:r>
-              <w:rPr>
-                <w:rFonts w:ascii="Courier New" w:cs="Courier New" w:eastAsia="Courier New" w:hAnsi="Courier New"/>
-                <w:sz w:val="18"/>
-                <w:szCs w:val="18"/>
-                <w:rtl w:val="0"/>
-              </w:rPr>
-              <w:t xml:space="preserve">        groups.setdefault(label, []).append(row)</w:t>
-            </w:r>
-            <w:r>
-              <w:rPr>
-                <w:rtl w:val="0"/>
-              </w:rPr>
-            </w:r>
-          </w:p>
-          <w:p>
-            <w:pPr>
-              <w:spacing w:after="0" w:line="360" w:lineRule="auto"/>
-              <w:jc w:val="both"/>
-              <w:rPr/>
-            </w:pPr>
-            <w:r>
-              <w:rPr>
-                <w:rFonts w:ascii="Courier New" w:cs="Courier New" w:eastAsia="Courier New" w:hAnsi="Courier New"/>
-                <w:sz w:val="18"/>
-                <w:szCs w:val="18"/>
-                <w:rtl w:val="0"/>
-              </w:rPr>
-              <w:t xml:space="preserve"> </w:t>
-            </w:r>
-            <w:r>
-              <w:rPr>
-                <w:rtl w:val="0"/>
-              </w:rPr>
-            </w:r>
-          </w:p>
-          <w:p>
-            <w:pPr>
-              <w:spacing w:after="0" w:line="360" w:lineRule="auto"/>
-              <w:jc w:val="both"/>
-              <w:rPr/>
-            </w:pPr>
-            <w:r>
-              <w:rPr>
-                <w:rFonts w:ascii="Courier New" w:cs="Courier New" w:eastAsia="Courier New" w:hAnsi="Courier New"/>
-                <w:sz w:val="18"/>
-                <w:szCs w:val="18"/>
-                <w:rtl w:val="0"/>
-              </w:rPr>
-              <w:t xml:space="preserve">    rng = random.Random(seed)</w:t>
-            </w:r>
-            <w:r>
-              <w:rPr>
-                <w:rtl w:val="0"/>
-              </w:rPr>
-            </w:r>
-          </w:p>
-          <w:p>
-            <w:pPr>
-              <w:spacing w:after="0" w:line="360" w:lineRule="auto"/>
-              <w:jc w:val="both"/>
-              <w:rPr/>
-            </w:pPr>
-            <w:r>
-              <w:rPr>
-                <w:rFonts w:ascii="Courier New" w:cs="Courier New" w:eastAsia="Courier New" w:hAnsi="Courier New"/>
-                <w:sz w:val="18"/>
-                <w:szCs w:val="18"/>
-                <w:rtl w:val="0"/>
-              </w:rPr>
-              <w:t xml:space="preserve">    train: list[Row] = []</w:t>
-            </w:r>
-            <w:r>
-              <w:rPr>
-                <w:rtl w:val="0"/>
-              </w:rPr>
-            </w:r>
-          </w:p>
-          <w:p>
-            <w:pPr>
-              <w:spacing w:after="0" w:line="360" w:lineRule="auto"/>
-              <w:jc w:val="both"/>
-              <w:rPr/>
-            </w:pPr>
-            <w:r>
-              <w:rPr>
-                <w:rFonts w:ascii="Courier New" w:cs="Courier New" w:eastAsia="Courier New" w:hAnsi="Courier New"/>
-                <w:sz w:val="18"/>
-                <w:szCs w:val="18"/>
-                <w:rtl w:val="0"/>
-              </w:rPr>
-              <w:t xml:space="preserve">    test: list[Row] = []</w:t>
-            </w:r>
-            <w:r>
-              <w:rPr>
-                <w:rtl w:val="0"/>
-              </w:rPr>
-            </w:r>
-          </w:p>
-          <w:p>
-            <w:pPr>
-              <w:spacing w:after="0" w:line="360" w:lineRule="auto"/>
-              <w:jc w:val="both"/>
-              <w:rPr/>
-            </w:pPr>
-            <w:r>
-              <w:rPr>
-                <w:rFonts w:ascii="Courier New" w:cs="Courier New" w:eastAsia="Courier New" w:hAnsi="Courier New"/>
-                <w:sz w:val="18"/>
-                <w:szCs w:val="18"/>
-                <w:rtl w:val="0"/>
-              </w:rPr>
-              <w:t xml:space="preserve">    for label in sorted(groups):</w:t>
-            </w:r>
-            <w:r>
-              <w:rPr>
-                <w:rtl w:val="0"/>
-              </w:rPr>
-            </w:r>
-          </w:p>
-          <w:p>
-            <w:pPr>
-              <w:spacing w:after="0" w:line="360" w:lineRule="auto"/>
-              <w:jc w:val="both"/>
-              <w:rPr/>
-            </w:pPr>
-            <w:r>
-              <w:rPr>
-                <w:rFonts w:ascii="Courier New" w:cs="Courier New" w:eastAsia="Courier New" w:hAnsi="Courier New"/>
-                <w:sz w:val="18"/>
-                <w:szCs w:val="18"/>
-                <w:rtl w:val="0"/>
-              </w:rPr>
-              <w:t xml:space="preserve">        group = groups[label][:]</w:t>
-            </w:r>
-            <w:r>
-              <w:rPr>
-                <w:rtl w:val="0"/>
-              </w:rPr>
-            </w:r>
-          </w:p>
-          <w:p>
-            <w:pPr>
-              <w:spacing w:after="0" w:line="360" w:lineRule="auto"/>
-              <w:jc w:val="both"/>
-              <w:rPr/>
-            </w:pPr>
-            <w:r>
-              <w:rPr>
-                <w:rFonts w:ascii="Courier New" w:cs="Courier New" w:eastAsia="Courier New" w:hAnsi="Courier New"/>
-                <w:sz w:val="18"/>
-                <w:szCs w:val="18"/>
-                <w:rtl w:val="0"/>
-              </w:rPr>
-              <w:t xml:space="preserve">        rng.shuffle(group)</w:t>
-            </w:r>
-            <w:r>
-              <w:rPr>
-                <w:rtl w:val="0"/>
-              </w:rPr>
-            </w:r>
-          </w:p>
-          <w:p>
-            <w:pPr>
-              <w:spacing w:after="0" w:line="360" w:lineRule="auto"/>
-              <w:jc w:val="both"/>
-              <w:rPr/>
-            </w:pPr>
-            <w:r>
-              <w:rPr>
-                <w:rFonts w:ascii="Courier New" w:cs="Courier New" w:eastAsia="Courier New" w:hAnsi="Courier New"/>
-                <w:sz w:val="18"/>
-                <w:szCs w:val="18"/>
-                <w:rtl w:val="0"/>
-              </w:rPr>
-              <w:t xml:space="preserve">        test_size = round(len(group) * test_fraction)</w:t>
-            </w:r>
-            <w:r>
-              <w:rPr>
-                <w:rtl w:val="0"/>
-              </w:rPr>
-            </w:r>
-          </w:p>
-          <w:p>
-            <w:pPr>
-              <w:spacing w:after="0" w:line="360" w:lineRule="auto"/>
-              <w:jc w:val="both"/>
-              <w:rPr/>
-            </w:pPr>
-            <w:r>
-              <w:rPr>
-                <w:rFonts w:ascii="Courier New" w:cs="Courier New" w:eastAsia="Courier New" w:hAnsi="Courier New"/>
-                <w:sz w:val="18"/>
-                <w:szCs w:val="18"/>
-                <w:rtl w:val="0"/>
-              </w:rPr>
-              <w:t xml:space="preserve">        test.extend(group[:test_size])</w:t>
-            </w:r>
-            <w:r>
-              <w:rPr>
-                <w:rtl w:val="0"/>
-              </w:rPr>
-            </w:r>
-          </w:p>
-          <w:p>
-            <w:pPr>
-              <w:spacing w:after="0" w:line="360" w:lineRule="auto"/>
-              <w:jc w:val="both"/>
-              <w:rPr/>
-            </w:pPr>
-            <w:r>
-              <w:rPr>
-                <w:rFonts w:ascii="Courier New" w:cs="Courier New" w:eastAsia="Courier New" w:hAnsi="Courier New"/>
-                <w:sz w:val="18"/>
-                <w:szCs w:val="18"/>
-                <w:rtl w:val="0"/>
-              </w:rPr>
-              <w:t xml:space="preserve">        train.extend(group[test_size:])</w:t>
-            </w:r>
-            <w:r>
-              <w:rPr>
-                <w:rtl w:val="0"/>
-              </w:rPr>
-            </w:r>
-          </w:p>
-          <w:p>
-            <w:pPr>
-              <w:spacing w:after="0" w:line="360" w:lineRule="auto"/>
-              <w:jc w:val="both"/>
-              <w:rPr/>
-            </w:pPr>
-            <w:r>
-              <w:rPr>
-                <w:rFonts w:ascii="Courier New" w:cs="Courier New" w:eastAsia="Courier New" w:hAnsi="Courier New"/>
-                <w:sz w:val="18"/>
-                <w:szCs w:val="18"/>
-                <w:rtl w:val="0"/>
-              </w:rPr>
-              <w:t xml:space="preserve">    return train, test</w:t>
+              <w:t xml:space="preserve">    """Return (train, test) with about the same label balance in both sets.</w:t>
+            </w:r>
+            <w:r>
+              <w:rPr>
+                <w:rtl w:val="0"/>
+              </w:rPr>
+            </w:r>
+          </w:p>
+          <w:p>
+            <w:pPr>
+              <w:spacing w:after="0" w:line="360" w:lineRule="auto"/>
+              <w:jc w:val="both"/>
+              <w:rPr/>
+            </w:pPr>
+            <w:r>
+              <w:rPr>
+                <w:rFonts w:ascii="Courier New" w:cs="Courier New" w:eastAsia="Courier New" w:hAnsi="Courier New"/>
+                <w:sz w:val="18"/>
+                <w:szCs w:val="18"/>
+                <w:rtl w:val="0"/>
+              </w:rPr>
+            </w:r>
+            <w:r>
+              <w:rPr>
+                <w:rtl w:val="0"/>
+              </w:rPr>
+            </w:r>
+          </w:p>
+          <w:p>
+            <w:pPr>
+              <w:spacing w:after="0" w:line="360" w:lineRule="auto"/>
+              <w:jc w:val="both"/>
+              <w:rPr/>
+            </w:pPr>
+            <w:r>
+              <w:rPr>
+                <w:rFonts w:ascii="Courier New" w:cs="Courier New" w:eastAsia="Courier New" w:hAnsi="Courier New"/>
+                <w:sz w:val="18"/>
+                <w:szCs w:val="18"/>
+                <w:rtl w:val="0"/>
+              </w:rPr>
+              <w:t xml:space="preserve">    Rows are grouped by label, and each group is split at `test_fraction`.</w:t>
+            </w:r>
+            <w:r>
+              <w:rPr>
+                <w:rtl w:val="0"/>
+              </w:rPr>
+            </w:r>
+          </w:p>
+          <w:p>
+            <w:pPr>
+              <w:spacing w:after="0" w:line="360" w:lineRule="auto"/>
+              <w:jc w:val="both"/>
+              <w:rPr/>
+            </w:pPr>
+            <w:r>
+              <w:rPr>
+                <w:rFonts w:ascii="Courier New" w:cs="Courier New" w:eastAsia="Courier New" w:hAnsi="Courier New"/>
+                <w:sz w:val="18"/>
+                <w:szCs w:val="18"/>
+                <w:rtl w:val="0"/>
+              </w:rPr>
+              <w:t xml:space="preserve">    One generator seeded with `seed` shuffles the groups and then both</w:t>
+            </w:r>
+            <w:r>
+              <w:rPr>
+                <w:rtl w:val="0"/>
+              </w:rPr>
+            </w:r>
+          </w:p>
+          <w:p>
+            <w:pPr>
+              <w:spacing w:after="0" w:line="360" w:lineRule="auto"/>
+              <w:jc w:val="both"/>
+              <w:rPr/>
+            </w:pPr>
+            <w:r>
+              <w:rPr>
+                <w:rFonts w:ascii="Courier New" w:cs="Courier New" w:eastAsia="Courier New" w:hAnsi="Courier New"/>
+                <w:sz w:val="18"/>
+                <w:szCs w:val="18"/>
+                <w:rtl w:val="0"/>
+              </w:rPr>
+              <w:t xml:space="preserve">    sets, so the same seed always produces the same split and neither set</w:t>
+            </w:r>
+            <w:r>
+              <w:rPr>
+                <w:rtl w:val="0"/>
+              </w:rPr>
+            </w:r>
+          </w:p>
+          <w:p>
+            <w:pPr>
+              <w:spacing w:after="0" w:line="360" w:lineRule="auto"/>
+              <w:jc w:val="both"/>
+              <w:rPr/>
+            </w:pPr>
+            <w:r>
+              <w:rPr>
+                <w:rFonts w:ascii="Courier New" w:cs="Courier New" w:eastAsia="Courier New" w:hAnsi="Courier New"/>
+                <w:sz w:val="18"/>
+                <w:szCs w:val="18"/>
+                <w:rtl w:val="0"/>
+              </w:rPr>
+              <w:t xml:space="preserve">    is ordered by label.</w:t>
+            </w:r>
+            <w:r>
+              <w:rPr>
+                <w:rtl w:val="0"/>
+              </w:rPr>
+            </w:r>
+          </w:p>
+          <w:p>
+            <w:pPr>
+              <w:spacing w:after="0" w:line="360" w:lineRule="auto"/>
+              <w:jc w:val="both"/>
+              <w:rPr/>
+            </w:pPr>
+            <w:r>
+              <w:rPr>
+                <w:rFonts w:ascii="Courier New" w:cs="Courier New" w:eastAsia="Courier New" w:hAnsi="Courier New"/>
+                <w:sz w:val="18"/>
+                <w:szCs w:val="18"/>
+                <w:rtl w:val="0"/>
+              </w:rPr>
+              <w:t xml:space="preserve">    """</w:t>
+            </w:r>
+            <w:r>
+              <w:rPr>
+                <w:rtl w:val="0"/>
+              </w:rPr>
+            </w:r>
+          </w:p>
+          <w:p>
+            <w:pPr>
+              <w:spacing w:after="0" w:line="360" w:lineRule="auto"/>
+              <w:jc w:val="both"/>
+              <w:rPr/>
+            </w:pPr>
+            <w:r>
+              <w:rPr>
+                <w:rFonts w:ascii="Courier New" w:cs="Courier New" w:eastAsia="Courier New" w:hAnsi="Courier New"/>
+                <w:sz w:val="18"/>
+                <w:szCs w:val="18"/>
+                <w:rtl w:val="0"/>
+              </w:rPr>
+              <w:t xml:space="preserve">    if not 0 &lt; test_fraction &lt; 1:</w:t>
+            </w:r>
+            <w:r>
+              <w:rPr>
+                <w:rtl w:val="0"/>
+              </w:rPr>
+            </w:r>
+          </w:p>
+          <w:p>
+            <w:pPr>
+              <w:spacing w:after="0" w:line="360" w:lineRule="auto"/>
+              <w:jc w:val="both"/>
+              <w:rPr/>
+            </w:pPr>
+            <w:r>
+              <w:rPr>
+                <w:rFonts w:ascii="Courier New" w:cs="Courier New" w:eastAsia="Courier New" w:hAnsi="Courier New"/>
+                <w:sz w:val="18"/>
+                <w:szCs w:val="18"/>
+                <w:rtl w:val="0"/>
+              </w:rPr>
+              <w:t xml:space="preserve">        raise ValueError("test_fraction must be between 0 and 1")</w:t>
+            </w:r>
+            <w:r>
+              <w:rPr>
+                <w:rtl w:val="0"/>
+              </w:rPr>
+            </w:r>
+          </w:p>
+          <w:p>
+            <w:pPr>
+              <w:spacing w:after="0" w:line="360" w:lineRule="auto"/>
+              <w:jc w:val="both"/>
+              <w:rPr/>
+            </w:pPr>
+            <w:r>
+              <w:rPr>
+                <w:rFonts w:ascii="Courier New" w:cs="Courier New" w:eastAsia="Courier New" w:hAnsi="Courier New"/>
+                <w:sz w:val="18"/>
+                <w:szCs w:val="18"/>
+                <w:rtl w:val="0"/>
+              </w:rPr>
+            </w:r>
+            <w:r>
+              <w:rPr>
+                <w:rtl w:val="0"/>
+              </w:rPr>
+            </w:r>
+          </w:p>
+          <w:p>
+            <w:pPr>
+              <w:spacing w:after="0" w:line="360" w:lineRule="auto"/>
+              <w:jc w:val="both"/>
+              <w:rPr/>
+            </w:pPr>
+            <w:r>
+              <w:rPr>
+                <w:rFonts w:ascii="Courier New" w:cs="Courier New" w:eastAsia="Courier New" w:hAnsi="Courier New"/>
+                <w:sz w:val="18"/>
+                <w:szCs w:val="18"/>
+                <w:rtl w:val="0"/>
+              </w:rPr>
+              <w:t xml:space="preserve">    groups: dict[float, list[Row]] = {}</w:t>
+            </w:r>
+            <w:r>
+              <w:rPr>
+                <w:rtl w:val="0"/>
+              </w:rPr>
+            </w:r>
+          </w:p>
+          <w:p>
+            <w:pPr>
+              <w:spacing w:after="0" w:line="360" w:lineRule="auto"/>
+              <w:jc w:val="both"/>
+              <w:rPr/>
+            </w:pPr>
+            <w:r>
+              <w:rPr>
+                <w:rFonts w:ascii="Courier New" w:cs="Courier New" w:eastAsia="Courier New" w:hAnsi="Courier New"/>
+                <w:sz w:val="18"/>
+                <w:szCs w:val="18"/>
+                <w:rtl w:val="0"/>
+              </w:rPr>
+              <w:t xml:space="preserve">    for row in rows:</w:t>
+            </w:r>
+            <w:r>
+              <w:rPr>
+                <w:rtl w:val="0"/>
+              </w:rPr>
+            </w:r>
+          </w:p>
+          <w:p>
+            <w:pPr>
+              <w:spacing w:after="0" w:line="360" w:lineRule="auto"/>
+              <w:jc w:val="both"/>
+              <w:rPr/>
+            </w:pPr>
+            <w:r>
+              <w:rPr>
+                <w:rFonts w:ascii="Courier New" w:cs="Courier New" w:eastAsia="Courier New" w:hAnsi="Courier New"/>
+                <w:sz w:val="18"/>
+                <w:szCs w:val="18"/>
+                <w:rtl w:val="0"/>
+              </w:rPr>
+              <w:t xml:space="preserve">        label = row[label_column]</w:t>
+            </w:r>
+            <w:r>
+              <w:rPr>
+                <w:rtl w:val="0"/>
+              </w:rPr>
+            </w:r>
+          </w:p>
+          <w:p>
+            <w:pPr>
+              <w:spacing w:after="0" w:line="360" w:lineRule="auto"/>
+              <w:jc w:val="both"/>
+              <w:rPr/>
+            </w:pPr>
+            <w:r>
+              <w:rPr>
+                <w:rFonts w:ascii="Courier New" w:cs="Courier New" w:eastAsia="Courier New" w:hAnsi="Courier New"/>
+                <w:sz w:val="18"/>
+                <w:szCs w:val="18"/>
+                <w:rtl w:val="0"/>
+              </w:rPr>
+              <w:t xml:space="preserve">        if label is None:</w:t>
+            </w:r>
+            <w:r>
+              <w:rPr>
+                <w:rtl w:val="0"/>
+              </w:rPr>
+            </w:r>
+          </w:p>
+          <w:p>
+            <w:pPr>
+              <w:spacing w:after="0" w:line="360" w:lineRule="auto"/>
+              <w:jc w:val="both"/>
+              <w:rPr/>
+            </w:pPr>
+            <w:r>
+              <w:rPr>
+                <w:rFonts w:ascii="Courier New" w:cs="Courier New" w:eastAsia="Courier New" w:hAnsi="Courier New"/>
+                <w:sz w:val="18"/>
+                <w:szCs w:val="18"/>
+                <w:rtl w:val="0"/>
+              </w:rPr>
+              <w:t xml:space="preserve">            raise ValueError(f"row has no {label_column} label")</w:t>
+            </w:r>
+            <w:r>
+              <w:rPr>
+                <w:rtl w:val="0"/>
+              </w:rPr>
+            </w:r>
+          </w:p>
+          <w:p>
+            <w:pPr>
+              <w:spacing w:after="0" w:line="360" w:lineRule="auto"/>
+              <w:jc w:val="both"/>
+              <w:rPr/>
+            </w:pPr>
+            <w:r>
+              <w:rPr>
+                <w:rFonts w:ascii="Courier New" w:cs="Courier New" w:eastAsia="Courier New" w:hAnsi="Courier New"/>
+                <w:sz w:val="18"/>
+                <w:szCs w:val="18"/>
+                <w:rtl w:val="0"/>
+              </w:rPr>
+              <w:t xml:space="preserve">        groups.setdefault(label, []).append(row)</w:t>
+            </w:r>
+            <w:r>
+              <w:rPr>
+                <w:rtl w:val="0"/>
+              </w:rPr>
+            </w:r>
+          </w:p>
+          <w:p>
+            <w:pPr>
+              <w:spacing w:after="0" w:line="360" w:lineRule="auto"/>
+              <w:jc w:val="both"/>
+              <w:rPr/>
+            </w:pPr>
+            <w:r>
+              <w:rPr>
+                <w:rFonts w:ascii="Courier New" w:cs="Courier New" w:eastAsia="Courier New" w:hAnsi="Courier New"/>
+                <w:sz w:val="18"/>
+                <w:szCs w:val="18"/>
+                <w:rtl w:val="0"/>
+              </w:rPr>
+            </w:r>
+            <w:r>
+              <w:rPr>
+                <w:rtl w:val="0"/>
+              </w:rPr>
+            </w:r>
+          </w:p>
+          <w:p>
+            <w:pPr>
+              <w:spacing w:after="0" w:line="360" w:lineRule="auto"/>
+              <w:jc w:val="both"/>
+              <w:rPr/>
+            </w:pPr>
+            <w:r>
+              <w:rPr>
+                <w:rFonts w:ascii="Courier New" w:cs="Courier New" w:eastAsia="Courier New" w:hAnsi="Courier New"/>
+                <w:sz w:val="18"/>
+                <w:szCs w:val="18"/>
+                <w:rtl w:val="0"/>
+              </w:rPr>
+              <w:t xml:space="preserve">    rng = random.Random(seed)</w:t>
+            </w:r>
+            <w:r>
+              <w:rPr>
+                <w:rtl w:val="0"/>
+              </w:rPr>
+            </w:r>
+          </w:p>
+          <w:p>
+            <w:pPr>
+              <w:spacing w:after="0" w:line="360" w:lineRule="auto"/>
+              <w:jc w:val="both"/>
+              <w:rPr/>
+            </w:pPr>
+            <w:r>
+              <w:rPr>
+                <w:rFonts w:ascii="Courier New" w:cs="Courier New" w:eastAsia="Courier New" w:hAnsi="Courier New"/>
+                <w:sz w:val="18"/>
+                <w:szCs w:val="18"/>
+                <w:rtl w:val="0"/>
+              </w:rPr>
+              <w:t xml:space="preserve">    train: list[Row] = []</w:t>
+            </w:r>
+            <w:r>
+              <w:rPr>
+                <w:rtl w:val="0"/>
+              </w:rPr>
+            </w:r>
+          </w:p>
+          <w:p>
+            <w:pPr>
+              <w:spacing w:after="0" w:line="360" w:lineRule="auto"/>
+              <w:jc w:val="both"/>
+              <w:rPr/>
+            </w:pPr>
+            <w:r>
+              <w:rPr>
+                <w:rFonts w:ascii="Courier New" w:cs="Courier New" w:eastAsia="Courier New" w:hAnsi="Courier New"/>
+                <w:sz w:val="18"/>
+                <w:szCs w:val="18"/>
+                <w:rtl w:val="0"/>
+              </w:rPr>
+              <w:t xml:space="preserve">    test: list[Row] = []</w:t>
+            </w:r>
+            <w:r>
+              <w:rPr>
+                <w:rtl w:val="0"/>
+              </w:rPr>
+            </w:r>
+          </w:p>
+          <w:p>
+            <w:pPr>
+              <w:spacing w:after="0" w:line="360" w:lineRule="auto"/>
+              <w:jc w:val="both"/>
+              <w:rPr/>
+            </w:pPr>
+            <w:r>
+              <w:rPr>
+                <w:rFonts w:ascii="Courier New" w:cs="Courier New" w:eastAsia="Courier New" w:hAnsi="Courier New"/>
+                <w:sz w:val="18"/>
+                <w:szCs w:val="18"/>
+                <w:rtl w:val="0"/>
+              </w:rPr>
+              <w:t xml:space="preserve">    for label in sorted(groups):</w:t>
+            </w:r>
+            <w:r>
+              <w:rPr>
+                <w:rtl w:val="0"/>
+              </w:rPr>
+            </w:r>
+          </w:p>
+          <w:p>
+            <w:pPr>
+              <w:spacing w:after="0" w:line="360" w:lineRule="auto"/>
+              <w:jc w:val="both"/>
+              <w:rPr/>
+            </w:pPr>
+            <w:r>
+              <w:rPr>
+                <w:rFonts w:ascii="Courier New" w:cs="Courier New" w:eastAsia="Courier New" w:hAnsi="Courier New"/>
+                <w:sz w:val="18"/>
+                <w:szCs w:val="18"/>
+                <w:rtl w:val="0"/>
+              </w:rPr>
+              <w:t xml:space="preserve">        group = groups[label][:]</w:t>
+            </w:r>
+            <w:r>
+              <w:rPr>
+                <w:rtl w:val="0"/>
+              </w:rPr>
+            </w:r>
+          </w:p>
+          <w:p>
+            <w:pPr>
+              <w:spacing w:after="0" w:line="360" w:lineRule="auto"/>
+              <w:jc w:val="both"/>
+              <w:rPr/>
+            </w:pPr>
+            <w:r>
+              <w:rPr>
+                <w:rFonts w:ascii="Courier New" w:cs="Courier New" w:eastAsia="Courier New" w:hAnsi="Courier New"/>
+                <w:sz w:val="18"/>
+                <w:szCs w:val="18"/>
+                <w:rtl w:val="0"/>
+              </w:rPr>
+              <w:t xml:space="preserve">        rng.shuffle(group)</w:t>
+            </w:r>
+            <w:r>
+              <w:rPr>
+                <w:rtl w:val="0"/>
+              </w:rPr>
+            </w:r>
+          </w:p>
+          <w:p>
+            <w:pPr>
+              <w:spacing w:after="0" w:line="360" w:lineRule="auto"/>
+              <w:jc w:val="both"/>
+              <w:rPr/>
+            </w:pPr>
+            <w:r>
+              <w:rPr>
+                <w:rFonts w:ascii="Courier New" w:cs="Courier New" w:eastAsia="Courier New" w:hAnsi="Courier New"/>
+                <w:sz w:val="18"/>
+                <w:szCs w:val="18"/>
+                <w:rtl w:val="0"/>
+              </w:rPr>
+              <w:t xml:space="preserve">        test_size = round(len(group) * test_fraction)</w:t>
+            </w:r>
+            <w:r>
+              <w:rPr>
+                <w:rtl w:val="0"/>
+              </w:rPr>
+            </w:r>
+          </w:p>
+          <w:p>
+            <w:pPr>
+              <w:spacing w:after="0" w:line="360" w:lineRule="auto"/>
+              <w:jc w:val="both"/>
+              <w:rPr/>
+            </w:pPr>
+            <w:r>
+              <w:rPr>
+                <w:rFonts w:ascii="Courier New" w:cs="Courier New" w:eastAsia="Courier New" w:hAnsi="Courier New"/>
+                <w:sz w:val="18"/>
+                <w:szCs w:val="18"/>
+                <w:rtl w:val="0"/>
+              </w:rPr>
+              <w:t xml:space="preserve">        test.extend(group[:test_size])</w:t>
+            </w:r>
+            <w:r>
+              <w:rPr>
+                <w:rtl w:val="0"/>
+              </w:rPr>
+            </w:r>
+          </w:p>
+          <w:p>
+            <w:pPr>
+              <w:spacing w:after="0" w:line="360" w:lineRule="auto"/>
+              <w:jc w:val="both"/>
+              <w:rPr/>
+            </w:pPr>
+            <w:r>
+              <w:rPr>
+                <w:rFonts w:ascii="Courier New" w:cs="Courier New" w:eastAsia="Courier New" w:hAnsi="Courier New"/>
+                <w:sz w:val="18"/>
+                <w:szCs w:val="18"/>
+                <w:rtl w:val="0"/>
+              </w:rPr>
+              <w:t xml:space="preserve">        train.extend(group[test_size:])</w:t>
+            </w:r>
+            <w:r>
+              <w:rPr>
+                <w:rtl w:val="0"/>
+              </w:rPr>
+            </w:r>
+          </w:p>
+          <w:p>
+            <w:pPr>
+              <w:spacing w:after="0" w:line="360" w:lineRule="auto"/>
+              <w:jc w:val="both"/>
+              <w:rPr/>
+            </w:pPr>
+            <w:r>
+              <w:rPr>
+                <w:rFonts w:ascii="Courier New" w:cs="Courier New" w:eastAsia="Courier New" w:hAnsi="Courier New"/>
+                <w:sz w:val="18"/>
+                <w:szCs w:val="18"/>
+                <w:rtl w:val="0"/>
+              </w:rPr>
+              <w:t xml:space="preserve">    rng.shuffle(train)</w:t>
+            </w:r>
+            <w:r>
+              <w:rPr>
+                <w:rtl w:val="0"/>
+              </w:rPr>
+            </w:r>
+          </w:p>
+          <w:p>
+            <w:pPr>
+              <w:spacing w:after="0" w:line="360" w:lineRule="auto"/>
+              <w:jc w:val="both"/>
+              <w:rPr/>
+            </w:pPr>
+            <w:r>
+              <w:rPr>
+                <w:rFonts w:ascii="Courier New" w:cs="Courier New" w:eastAsia="Courier New" w:hAnsi="Courier New"/>
+                <w:sz w:val="18"/>
+                <w:szCs w:val="18"/>
+                <w:rtl w:val="0"/>
+              </w:rPr>
+              <w:t xml:space="preserve">    rng.shuffle(test)</w:t>
+            </w:r>
+            <w:r>
+              <w:rPr>
+                <w:rtl w:val="0"/>
+              </w:rPr>
+            </w:r>
+          </w:p>
+          <w:p>
+            <w:pPr>
+              <w:spacing w:after="0" w:line="360" w:lineRule="auto"/>
+              <w:jc w:val="both"/>
+              <w:rPr/>
+            </w:pPr>
+            <w:r>
+              <w:rPr>
+                <w:rFonts w:ascii="Courier New" w:cs="Courier New" w:eastAsia="Courier New" w:hAnsi="Courier New"/>
+                <w:sz w:val="18"/>
+                <w:szCs w:val="18"/>
+                <w:rtl w:val="0"/>
+              </w:rPr>
+              <w:t xml:space="preserve">    return train, test</w:t>
             </w:r>
             <w:r>
               <w:rPr>
@@ -9062,7 +9139,6 @@
                 <w:szCs w:val="18"/>
                 <w:rtl w:val="0"/>
               </w:rPr>
-              <w:t xml:space="preserve"> </w:t>
             </w:r>
             <w:r>
               <w:rPr>
@@ -9146,28 +9222,26 @@
                 <w:szCs w:val="18"/>
                 <w:rtl w:val="0"/>
               </w:rPr>
-              <w:t xml:space="preserve"> </w:t>
-            </w:r>
-            <w:r>
-              <w:rPr>
-                <w:rtl w:val="0"/>
-              </w:rPr>
-            </w:r>
-          </w:p>
-          <w:p>
-            <w:pPr>
-              <w:spacing w:after="0" w:line="360" w:lineRule="auto"/>
-              <w:jc w:val="both"/>
-              <w:rPr/>
-            </w:pPr>
-            <w:r>
-              <w:rPr>
-                <w:rFonts w:ascii="Courier New" w:cs="Courier New" w:eastAsia="Courier New" w:hAnsi="Courier New"/>
-                <w:sz w:val="18"/>
-                <w:szCs w:val="18"/>
-                <w:rtl w:val="0"/>
-              </w:rPr>
-              <w:t xml:space="preserve"> </w:t>
+            </w:r>
+            <w:r>
+              <w:rPr>
+                <w:rtl w:val="0"/>
+              </w:rPr>
+            </w:r>
+          </w:p>
+          <w:p>
+            <w:pPr>
+              <w:spacing w:after="0" w:line="360" w:lineRule="auto"/>
+              <w:jc w:val="both"/>
+              <w:rPr/>
+            </w:pPr>
+            <w:r>
+              <w:rPr>
+                <w:rFonts w:ascii="Courier New" w:cs="Courier New" w:eastAsia="Courier New" w:hAnsi="Courier New"/>
+                <w:sz w:val="18"/>
+                <w:szCs w:val="18"/>
+                <w:rtl w:val="0"/>
+              </w:rPr>
             </w:r>
             <w:r>
               <w:rPr>
@@ -9230,28 +9304,26 @@
                 <w:szCs w:val="18"/>
                 <w:rtl w:val="0"/>
               </w:rPr>
-              <w:t xml:space="preserve"> </w:t>
-            </w:r>
-            <w:r>
-              <w:rPr>
-                <w:rtl w:val="0"/>
-              </w:rPr>
-            </w:r>
-          </w:p>
-          <w:p>
-            <w:pPr>
-              <w:spacing w:after="0" w:line="360" w:lineRule="auto"/>
-              <w:jc w:val="both"/>
-              <w:rPr/>
-            </w:pPr>
-            <w:r>
-              <w:rPr>
-                <w:rFonts w:ascii="Courier New" w:cs="Courier New" w:eastAsia="Courier New" w:hAnsi="Courier New"/>
-                <w:sz w:val="18"/>
-                <w:szCs w:val="18"/>
-                <w:rtl w:val="0"/>
-              </w:rPr>
-              <w:t xml:space="preserve"> </w:t>
+            </w:r>
+            <w:r>
+              <w:rPr>
+                <w:rtl w:val="0"/>
+              </w:rPr>
+            </w:r>
+          </w:p>
+          <w:p>
+            <w:pPr>
+              <w:spacing w:after="0" w:line="360" w:lineRule="auto"/>
+              <w:jc w:val="both"/>
+              <w:rPr/>
+            </w:pPr>
+            <w:r>
+              <w:rPr>
+                <w:rFonts w:ascii="Courier New" w:cs="Courier New" w:eastAsia="Courier New" w:hAnsi="Courier New"/>
+                <w:sz w:val="18"/>
+                <w:szCs w:val="18"/>
+                <w:rtl w:val="0"/>
+              </w:rPr>
             </w:r>
             <w:r>
               <w:rPr>
@@ -9293,574 +9365,567 @@
                 <w:szCs w:val="18"/>
                 <w:rtl w:val="0"/>
               </w:rPr>
-              <w:t xml:space="preserve">    """Clean, scale, and split customer records into train and test sets."""</w:t>
-            </w:r>
-            <w:r>
-              <w:rPr>
-                <w:rtl w:val="0"/>
-              </w:rPr>
-            </w:r>
-          </w:p>
-          <w:p>
-            <w:pPr>
-              <w:spacing w:after="0" w:line="360" w:lineRule="auto"/>
-              <w:jc w:val="both"/>
-              <w:rPr/>
-            </w:pPr>
-            <w:r>
-              <w:rPr>
-                <w:rFonts w:ascii="Courier New" w:cs="Courier New" w:eastAsia="Courier New" w:hAnsi="Courier New"/>
-                <w:sz w:val="18"/>
-                <w:szCs w:val="18"/>
-                <w:rtl w:val="0"/>
-              </w:rPr>
-              <w:t xml:space="preserve">    # Every column in the data is used as a feature.</w:t>
-            </w:r>
-            <w:r>
-              <w:rPr>
-                <w:rtl w:val="0"/>
-              </w:rPr>
-            </w:r>
-          </w:p>
-          <w:p>
-            <w:pPr>
-              <w:spacing w:after="0" w:line="360" w:lineRule="auto"/>
-              <w:jc w:val="both"/>
-              <w:rPr/>
-            </w:pPr>
-            <w:r>
-              <w:rPr>
-                <w:rFonts w:ascii="Courier New" w:cs="Courier New" w:eastAsia="Courier New" w:hAnsi="Courier New"/>
-                <w:sz w:val="18"/>
-                <w:szCs w:val="18"/>
-                <w:rtl w:val="0"/>
-              </w:rPr>
-              <w:t xml:space="preserve">    feature_names = list(rows[0])</w:t>
-            </w:r>
-            <w:r>
-              <w:rPr>
-                <w:rtl w:val="0"/>
-              </w:rPr>
-            </w:r>
-          </w:p>
-          <w:p>
-            <w:pPr>
-              <w:spacing w:after="0" w:line="360" w:lineRule="auto"/>
-              <w:jc w:val="both"/>
-              <w:rPr/>
-            </w:pPr>
-            <w:r>
-              <w:rPr>
-                <w:rFonts w:ascii="Courier New" w:cs="Courier New" w:eastAsia="Courier New" w:hAnsi="Courier New"/>
-                <w:sz w:val="18"/>
-                <w:szCs w:val="18"/>
-                <w:rtl w:val="0"/>
-              </w:rPr>
-              <w:t xml:space="preserve"> </w:t>
-            </w:r>
-            <w:r>
-              <w:rPr>
-                <w:rtl w:val="0"/>
-              </w:rPr>
-            </w:r>
-          </w:p>
-          <w:p>
-            <w:pPr>
-              <w:spacing w:after="0" w:line="360" w:lineRule="auto"/>
-              <w:jc w:val="both"/>
-              <w:rPr/>
-            </w:pPr>
-            <w:r>
-              <w:rPr>
-                <w:rFonts w:ascii="Courier New" w:cs="Courier New" w:eastAsia="Courier New" w:hAnsi="Courier New"/>
-                <w:sz w:val="18"/>
-                <w:szCs w:val="18"/>
-                <w:rtl w:val="0"/>
-              </w:rPr>
-              <w:t xml:space="preserve">    # Models cannot handle missing values, so fill the gaps first.</w:t>
-            </w:r>
-            <w:r>
-              <w:rPr>
-                <w:rtl w:val="0"/>
-              </w:rPr>
-            </w:r>
-          </w:p>
-          <w:p>
-            <w:pPr>
-              <w:spacing w:after="0" w:line="360" w:lineRule="auto"/>
-              <w:jc w:val="both"/>
-              <w:rPr/>
-            </w:pPr>
-            <w:r>
-              <w:rPr>
-                <w:rFonts w:ascii="Courier New" w:cs="Courier New" w:eastAsia="Courier New" w:hAnsi="Courier New"/>
-                <w:sz w:val="18"/>
-                <w:szCs w:val="18"/>
-                <w:rtl w:val="0"/>
-              </w:rPr>
-              <w:t xml:space="preserve">    filled = [_fill_missing(row) for row in rows]</w:t>
-            </w:r>
-            <w:r>
-              <w:rPr>
-                <w:rtl w:val="0"/>
-              </w:rPr>
-            </w:r>
-          </w:p>
-          <w:p>
-            <w:pPr>
-              <w:spacing w:after="0" w:line="360" w:lineRule="auto"/>
-              <w:jc w:val="both"/>
-              <w:rPr/>
-            </w:pPr>
-            <w:r>
-              <w:rPr>
-                <w:rFonts w:ascii="Courier New" w:cs="Courier New" w:eastAsia="Courier New" w:hAnsi="Courier New"/>
-                <w:sz w:val="18"/>
-                <w:szCs w:val="18"/>
-                <w:rtl w:val="0"/>
-              </w:rPr>
-              <w:t xml:space="preserve"> </w:t>
-            </w:r>
-            <w:r>
-              <w:rPr>
-                <w:rtl w:val="0"/>
-              </w:rPr>
-            </w:r>
-          </w:p>
-          <w:p>
-            <w:pPr>
-              <w:spacing w:after="0" w:line="360" w:lineRule="auto"/>
-              <w:jc w:val="both"/>
-              <w:rPr/>
-            </w:pPr>
-            <w:r>
-              <w:rPr>
-                <w:rFonts w:ascii="Courier New" w:cs="Courier New" w:eastAsia="Courier New" w:hAnsi="Courier New"/>
-                <w:sz w:val="18"/>
-                <w:szCs w:val="18"/>
-                <w:rtl w:val="0"/>
-              </w:rPr>
-              <w:t xml:space="preserve">    stats = fit_standardizer(filled, feature_names)</w:t>
-            </w:r>
-            <w:r>
-              <w:rPr>
-                <w:rtl w:val="0"/>
-              </w:rPr>
-            </w:r>
-          </w:p>
-          <w:p>
-            <w:pPr>
-              <w:spacing w:after="0" w:line="360" w:lineRule="auto"/>
-              <w:jc w:val="both"/>
-              <w:rPr/>
-            </w:pPr>
-            <w:r>
-              <w:rPr>
-                <w:rFonts w:ascii="Courier New" w:cs="Courier New" w:eastAsia="Courier New" w:hAnsi="Courier New"/>
-                <w:sz w:val="18"/>
-                <w:szCs w:val="18"/>
-                <w:rtl w:val="0"/>
-              </w:rPr>
-              <w:t xml:space="preserve">    scaled = apply_standardizer(filled, stats)</w:t>
-            </w:r>
-            <w:r>
-              <w:rPr>
-                <w:rtl w:val="0"/>
-              </w:rPr>
-            </w:r>
-          </w:p>
-          <w:p>
-            <w:pPr>
-              <w:spacing w:after="0" w:line="360" w:lineRule="auto"/>
-              <w:jc w:val="both"/>
-              <w:rPr/>
-            </w:pPr>
-            <w:r>
-              <w:rPr>
-                <w:rFonts w:ascii="Courier New" w:cs="Courier New" w:eastAsia="Courier New" w:hAnsi="Courier New"/>
-                <w:sz w:val="18"/>
-                <w:szCs w:val="18"/>
-                <w:rtl w:val="0"/>
-              </w:rPr>
-              <w:t xml:space="preserve"> </w:t>
-            </w:r>
-            <w:r>
-              <w:rPr>
-                <w:rtl w:val="0"/>
-              </w:rPr>
-            </w:r>
-          </w:p>
-          <w:p>
-            <w:pPr>
-              <w:spacing w:after="0" w:line="360" w:lineRule="auto"/>
-              <w:jc w:val="both"/>
-              <w:rPr/>
-            </w:pPr>
-            <w:r>
-              <w:rPr>
-                <w:rFonts w:ascii="Courier New" w:cs="Courier New" w:eastAsia="Courier New" w:hAnsi="Courier New"/>
-                <w:sz w:val="18"/>
-                <w:szCs w:val="18"/>
-                <w:rtl w:val="0"/>
-              </w:rPr>
-              <w:t xml:space="preserve">    examples = [</w:t>
-            </w:r>
-            <w:r>
-              <w:rPr>
-                <w:rtl w:val="0"/>
-              </w:rPr>
-            </w:r>
-          </w:p>
-          <w:p>
-            <w:pPr>
-              <w:spacing w:after="0" w:line="360" w:lineRule="auto"/>
-              <w:jc w:val="both"/>
-              <w:rPr/>
-            </w:pPr>
-            <w:r>
-              <w:rPr>
-                <w:rFonts w:ascii="Courier New" w:cs="Courier New" w:eastAsia="Courier New" w:hAnsi="Courier New"/>
-                <w:sz w:val="18"/>
-                <w:szCs w:val="18"/>
-                <w:rtl w:val="0"/>
-              </w:rPr>
-              <w:t xml:space="preserve">        (_to_vector(row, feature_names), _label(original))</w:t>
-            </w:r>
-            <w:r>
-              <w:rPr>
-                <w:rtl w:val="0"/>
-              </w:rPr>
-            </w:r>
-          </w:p>
-          <w:p>
-            <w:pPr>
-              <w:spacing w:after="0" w:line="360" w:lineRule="auto"/>
-              <w:jc w:val="both"/>
-              <w:rPr/>
-            </w:pPr>
-            <w:r>
-              <w:rPr>
-                <w:rFonts w:ascii="Courier New" w:cs="Courier New" w:eastAsia="Courier New" w:hAnsi="Courier New"/>
-                <w:sz w:val="18"/>
-                <w:szCs w:val="18"/>
-                <w:rtl w:val="0"/>
-              </w:rPr>
-              <w:t xml:space="preserve">        for row, original in zip(scaled, rows, strict=True)</w:t>
-            </w:r>
-            <w:r>
-              <w:rPr>
-                <w:rtl w:val="0"/>
-              </w:rPr>
-            </w:r>
-          </w:p>
-          <w:p>
-            <w:pPr>
-              <w:spacing w:after="0" w:line="360" w:lineRule="auto"/>
-              <w:jc w:val="both"/>
-              <w:rPr/>
-            </w:pPr>
-            <w:r>
-              <w:rPr>
-                <w:rFonts w:ascii="Courier New" w:cs="Courier New" w:eastAsia="Courier New" w:hAnsi="Courier New"/>
-                <w:sz w:val="18"/>
-                <w:szCs w:val="18"/>
-                <w:rtl w:val="0"/>
-              </w:rPr>
-              <w:t xml:space="preserve">    ]</w:t>
-            </w:r>
-            <w:r>
-              <w:rPr>
-                <w:rtl w:val="0"/>
-              </w:rPr>
-            </w:r>
-          </w:p>
-          <w:p>
-            <w:pPr>
-              <w:spacing w:after="0" w:line="360" w:lineRule="auto"/>
-              <w:jc w:val="both"/>
-              <w:rPr/>
-            </w:pPr>
-            <w:r>
-              <w:rPr>
-                <w:rFonts w:ascii="Courier New" w:cs="Courier New" w:eastAsia="Courier New" w:hAnsi="Courier New"/>
-                <w:sz w:val="18"/>
-                <w:szCs w:val="18"/>
-                <w:rtl w:val="0"/>
-              </w:rPr>
-              <w:t xml:space="preserve"> </w:t>
-            </w:r>
-            <w:r>
-              <w:rPr>
-                <w:rtl w:val="0"/>
-              </w:rPr>
-            </w:r>
-          </w:p>
-          <w:p>
-            <w:pPr>
-              <w:spacing w:after="0" w:line="360" w:lineRule="auto"/>
-              <w:jc w:val="both"/>
-              <w:rPr/>
-            </w:pPr>
-            <w:r>
-              <w:rPr>
-                <w:rFonts w:ascii="Courier New" w:cs="Courier New" w:eastAsia="Courier New" w:hAnsi="Courier New"/>
-                <w:sz w:val="18"/>
-                <w:szCs w:val="18"/>
-                <w:rtl w:val="0"/>
-              </w:rPr>
-              <w:t xml:space="preserve">    random.shuffle(examples)</w:t>
-            </w:r>
-            <w:r>
-              <w:rPr>
-                <w:rtl w:val="0"/>
-              </w:rPr>
-            </w:r>
-          </w:p>
-          <w:p>
-            <w:pPr>
-              <w:spacing w:after="0" w:line="360" w:lineRule="auto"/>
-              <w:jc w:val="both"/>
-              <w:rPr/>
-            </w:pPr>
-            <w:r>
-              <w:rPr>
-                <w:rFonts w:ascii="Courier New" w:cs="Courier New" w:eastAsia="Courier New" w:hAnsi="Courier New"/>
-                <w:sz w:val="18"/>
-                <w:szCs w:val="18"/>
-                <w:rtl w:val="0"/>
-              </w:rPr>
-              <w:t xml:space="preserve">    cut = int(len(examples) * (1 - TEST_FRACTION))</w:t>
-            </w:r>
-            <w:r>
-              <w:rPr>
-                <w:rtl w:val="0"/>
-              </w:rPr>
-            </w:r>
-          </w:p>
-          <w:p>
-            <w:pPr>
-              <w:spacing w:after="0" w:line="360" w:lineRule="auto"/>
-              <w:jc w:val="both"/>
-              <w:rPr/>
-            </w:pPr>
-            <w:r>
-              <w:rPr>
-                <w:rFonts w:ascii="Courier New" w:cs="Courier New" w:eastAsia="Courier New" w:hAnsi="Courier New"/>
-                <w:sz w:val="18"/>
-                <w:szCs w:val="18"/>
-                <w:rtl w:val="0"/>
-              </w:rPr>
-              <w:t xml:space="preserve">    train, test = examples[:cut], examples[cut:]</w:t>
-            </w:r>
-            <w:r>
-              <w:rPr>
-                <w:rtl w:val="0"/>
-              </w:rPr>
-            </w:r>
-          </w:p>
-          <w:p>
-            <w:pPr>
-              <w:spacing w:after="0" w:line="360" w:lineRule="auto"/>
-              <w:jc w:val="both"/>
-              <w:rPr/>
-            </w:pPr>
-            <w:r>
-              <w:rPr>
-                <w:rFonts w:ascii="Courier New" w:cs="Courier New" w:eastAsia="Courier New" w:hAnsi="Courier New"/>
-                <w:sz w:val="18"/>
-                <w:szCs w:val="18"/>
-                <w:rtl w:val="0"/>
-              </w:rPr>
-              <w:t xml:space="preserve"> </w:t>
-            </w:r>
-            <w:r>
-              <w:rPr>
-                <w:rtl w:val="0"/>
-              </w:rPr>
-            </w:r>
-          </w:p>
-          <w:p>
-            <w:pPr>
-              <w:spacing w:after="0" w:line="360" w:lineRule="auto"/>
-              <w:jc w:val="both"/>
-              <w:rPr/>
-            </w:pPr>
-            <w:r>
-              <w:rPr>
-                <w:rFonts w:ascii="Courier New" w:cs="Courier New" w:eastAsia="Courier New" w:hAnsi="Courier New"/>
-                <w:sz w:val="18"/>
-                <w:szCs w:val="18"/>
-                <w:rtl w:val="0"/>
-              </w:rPr>
-              <w:t xml:space="preserve">    return TrainingSets(</w:t>
-            </w:r>
-            <w:r>
-              <w:rPr>
-                <w:rtl w:val="0"/>
-              </w:rPr>
-            </w:r>
-          </w:p>
-          <w:p>
-            <w:pPr>
-              <w:spacing w:after="0" w:line="360" w:lineRule="auto"/>
-              <w:jc w:val="both"/>
-              <w:rPr/>
-            </w:pPr>
-            <w:r>
-              <w:rPr>
-                <w:rFonts w:ascii="Courier New" w:cs="Courier New" w:eastAsia="Courier New" w:hAnsi="Courier New"/>
-                <w:sz w:val="18"/>
-                <w:szCs w:val="18"/>
-                <w:rtl w:val="0"/>
-              </w:rPr>
-              <w:t xml:space="preserve">        feature_names=feature_names,</w:t>
-            </w:r>
-            <w:r>
-              <w:rPr>
-                <w:rtl w:val="0"/>
-              </w:rPr>
-            </w:r>
-          </w:p>
-          <w:p>
-            <w:pPr>
-              <w:spacing w:after="0" w:line="360" w:lineRule="auto"/>
-              <w:jc w:val="both"/>
-              <w:rPr/>
-            </w:pPr>
-            <w:r>
-              <w:rPr>
-                <w:rFonts w:ascii="Courier New" w:cs="Courier New" w:eastAsia="Courier New" w:hAnsi="Courier New"/>
-                <w:sz w:val="18"/>
-                <w:szCs w:val="18"/>
-                <w:rtl w:val="0"/>
-              </w:rPr>
-              <w:t xml:space="preserve">        train_features=[features for features, _ in train],</w:t>
-            </w:r>
-            <w:r>
-              <w:rPr>
-                <w:rtl w:val="0"/>
-              </w:rPr>
-            </w:r>
-          </w:p>
-          <w:p>
-            <w:pPr>
-              <w:spacing w:after="0" w:line="360" w:lineRule="auto"/>
-              <w:jc w:val="both"/>
-              <w:rPr/>
-            </w:pPr>
-            <w:r>
-              <w:rPr>
-                <w:rFonts w:ascii="Courier New" w:cs="Courier New" w:eastAsia="Courier New" w:hAnsi="Courier New"/>
-                <w:sz w:val="18"/>
-                <w:szCs w:val="18"/>
-                <w:rtl w:val="0"/>
-              </w:rPr>
-              <w:t xml:space="preserve">        train_labels=[label for _, label in train],</w:t>
-            </w:r>
-            <w:r>
-              <w:rPr>
-                <w:rtl w:val="0"/>
-              </w:rPr>
-            </w:r>
-          </w:p>
-          <w:p>
-            <w:pPr>
-              <w:spacing w:after="0" w:line="360" w:lineRule="auto"/>
-              <w:jc w:val="both"/>
-              <w:rPr/>
-            </w:pPr>
-            <w:r>
-              <w:rPr>
-                <w:rFonts w:ascii="Courier New" w:cs="Courier New" w:eastAsia="Courier New" w:hAnsi="Courier New"/>
-                <w:sz w:val="18"/>
-                <w:szCs w:val="18"/>
-                <w:rtl w:val="0"/>
-              </w:rPr>
-              <w:t xml:space="preserve">        test_features=[features for features, _ in test],</w:t>
-            </w:r>
-            <w:r>
-              <w:rPr>
-                <w:rtl w:val="0"/>
-              </w:rPr>
-            </w:r>
-          </w:p>
-          <w:p>
-            <w:pPr>
-              <w:spacing w:after="0" w:line="360" w:lineRule="auto"/>
-              <w:jc w:val="both"/>
-              <w:rPr/>
-            </w:pPr>
-            <w:r>
-              <w:rPr>
-                <w:rFonts w:ascii="Courier New" w:cs="Courier New" w:eastAsia="Courier New" w:hAnsi="Courier New"/>
-                <w:sz w:val="18"/>
-                <w:szCs w:val="18"/>
-                <w:rtl w:val="0"/>
-              </w:rPr>
-              <w:t xml:space="preserve">        test_labels=[label for _, label in test],</w:t>
-            </w:r>
-            <w:r>
-              <w:rPr>
-                <w:rtl w:val="0"/>
-              </w:rPr>
-            </w:r>
-          </w:p>
-          <w:p>
-            <w:pPr>
-              <w:spacing w:after="0" w:line="360" w:lineRule="auto"/>
-              <w:jc w:val="both"/>
-              <w:rPr/>
-            </w:pPr>
-            <w:r>
-              <w:rPr>
-                <w:rFonts w:ascii="Courier New" w:cs="Courier New" w:eastAsia="Courier New" w:hAnsi="Courier New"/>
-                <w:sz w:val="18"/>
-                <w:szCs w:val="18"/>
-                <w:rtl w:val="0"/>
-              </w:rPr>
-              <w:t xml:space="preserve">    )</w:t>
-            </w:r>
-            <w:r>
-              <w:rPr>
-                <w:rtl w:val="0"/>
-              </w:rPr>
-            </w:r>
-          </w:p>
-          <w:p>
-            <w:pPr>
-              <w:spacing w:after="0" w:line="360" w:lineRule="auto"/>
-              <w:jc w:val="both"/>
-              <w:rPr/>
-            </w:pPr>
-            <w:r>
-              <w:rPr>
-                <w:rFonts w:ascii="Courier New" w:cs="Courier New" w:eastAsia="Courier New" w:hAnsi="Courier New"/>
-                <w:sz w:val="18"/>
-                <w:szCs w:val="18"/>
-                <w:rtl w:val="0"/>
-              </w:rPr>
-              <w:t xml:space="preserve"> </w:t>
-            </w:r>
-            <w:r>
-              <w:rPr>
-                <w:rtl w:val="0"/>
-              </w:rPr>
-            </w:r>
-          </w:p>
-          <w:p>
-            <w:pPr>
-              <w:spacing w:after="0" w:line="360" w:lineRule="auto"/>
-              <w:jc w:val="both"/>
-              <w:rPr/>
-            </w:pPr>
-            <w:r>
-              <w:rPr>
-                <w:rFonts w:ascii="Courier New" w:cs="Courier New" w:eastAsia="Courier New" w:hAnsi="Courier New"/>
-                <w:sz w:val="18"/>
-                <w:szCs w:val="18"/>
-                <w:rtl w:val="0"/>
-              </w:rPr>
-              <w:t xml:space="preserve"> </w:t>
+              <w:t xml:space="preserve">    """Clean, scale, and split customer records into train and test sets."""</w:t>
+            </w:r>
+            <w:r>
+              <w:rPr>
+                <w:rtl w:val="0"/>
+              </w:rPr>
+            </w:r>
+          </w:p>
+          <w:p>
+            <w:pPr>
+              <w:spacing w:after="0" w:line="360" w:lineRule="auto"/>
+              <w:jc w:val="both"/>
+              <w:rPr/>
+            </w:pPr>
+            <w:r>
+              <w:rPr>
+                <w:rFonts w:ascii="Courier New" w:cs="Courier New" w:eastAsia="Courier New" w:hAnsi="Courier New"/>
+                <w:sz w:val="18"/>
+                <w:szCs w:val="18"/>
+                <w:rtl w:val="0"/>
+              </w:rPr>
+              <w:t xml:space="preserve">    # Every column in the data is used as a feature.</w:t>
+            </w:r>
+            <w:r>
+              <w:rPr>
+                <w:rtl w:val="0"/>
+              </w:rPr>
+            </w:r>
+          </w:p>
+          <w:p>
+            <w:pPr>
+              <w:spacing w:after="0" w:line="360" w:lineRule="auto"/>
+              <w:jc w:val="both"/>
+              <w:rPr/>
+            </w:pPr>
+            <w:r>
+              <w:rPr>
+                <w:rFonts w:ascii="Courier New" w:cs="Courier New" w:eastAsia="Courier New" w:hAnsi="Courier New"/>
+                <w:sz w:val="18"/>
+                <w:szCs w:val="18"/>
+                <w:rtl w:val="0"/>
+              </w:rPr>
+              <w:t xml:space="preserve">    feature_names = list(rows[0])</w:t>
+            </w:r>
+            <w:r>
+              <w:rPr>
+                <w:rtl w:val="0"/>
+              </w:rPr>
+            </w:r>
+          </w:p>
+          <w:p>
+            <w:pPr>
+              <w:spacing w:after="0" w:line="360" w:lineRule="auto"/>
+              <w:jc w:val="both"/>
+              <w:rPr/>
+            </w:pPr>
+            <w:r>
+              <w:rPr>
+                <w:rFonts w:ascii="Courier New" w:cs="Courier New" w:eastAsia="Courier New" w:hAnsi="Courier New"/>
+                <w:sz w:val="18"/>
+                <w:szCs w:val="18"/>
+                <w:rtl w:val="0"/>
+              </w:rPr>
+            </w:r>
+            <w:r>
+              <w:rPr>
+                <w:rtl w:val="0"/>
+              </w:rPr>
+            </w:r>
+          </w:p>
+          <w:p>
+            <w:pPr>
+              <w:spacing w:after="0" w:line="360" w:lineRule="auto"/>
+              <w:jc w:val="both"/>
+              <w:rPr/>
+            </w:pPr>
+            <w:r>
+              <w:rPr>
+                <w:rFonts w:ascii="Courier New" w:cs="Courier New" w:eastAsia="Courier New" w:hAnsi="Courier New"/>
+                <w:sz w:val="18"/>
+                <w:szCs w:val="18"/>
+                <w:rtl w:val="0"/>
+              </w:rPr>
+              <w:t xml:space="preserve">    # Models cannot handle missing values, so fill the gaps first.</w:t>
+            </w:r>
+            <w:r>
+              <w:rPr>
+                <w:rtl w:val="0"/>
+              </w:rPr>
+            </w:r>
+          </w:p>
+          <w:p>
+            <w:pPr>
+              <w:spacing w:after="0" w:line="360" w:lineRule="auto"/>
+              <w:jc w:val="both"/>
+              <w:rPr/>
+            </w:pPr>
+            <w:r>
+              <w:rPr>
+                <w:rFonts w:ascii="Courier New" w:cs="Courier New" w:eastAsia="Courier New" w:hAnsi="Courier New"/>
+                <w:sz w:val="18"/>
+                <w:szCs w:val="18"/>
+                <w:rtl w:val="0"/>
+              </w:rPr>
+              <w:t xml:space="preserve">    filled = [_fill_missing(row) for row in rows]</w:t>
+            </w:r>
+            <w:r>
+              <w:rPr>
+                <w:rtl w:val="0"/>
+              </w:rPr>
+            </w:r>
+          </w:p>
+          <w:p>
+            <w:pPr>
+              <w:spacing w:after="0" w:line="360" w:lineRule="auto"/>
+              <w:jc w:val="both"/>
+              <w:rPr/>
+            </w:pPr>
+            <w:r>
+              <w:rPr>
+                <w:rFonts w:ascii="Courier New" w:cs="Courier New" w:eastAsia="Courier New" w:hAnsi="Courier New"/>
+                <w:sz w:val="18"/>
+                <w:szCs w:val="18"/>
+                <w:rtl w:val="0"/>
+              </w:rPr>
+            </w:r>
+            <w:r>
+              <w:rPr>
+                <w:rtl w:val="0"/>
+              </w:rPr>
+            </w:r>
+          </w:p>
+          <w:p>
+            <w:pPr>
+              <w:spacing w:after="0" w:line="360" w:lineRule="auto"/>
+              <w:jc w:val="both"/>
+              <w:rPr/>
+            </w:pPr>
+            <w:r>
+              <w:rPr>
+                <w:rFonts w:ascii="Courier New" w:cs="Courier New" w:eastAsia="Courier New" w:hAnsi="Courier New"/>
+                <w:sz w:val="18"/>
+                <w:szCs w:val="18"/>
+                <w:rtl w:val="0"/>
+              </w:rPr>
+              <w:t xml:space="preserve">    stats = fit_standardizer(filled, feature_names)</w:t>
+            </w:r>
+            <w:r>
+              <w:rPr>
+                <w:rtl w:val="0"/>
+              </w:rPr>
+            </w:r>
+          </w:p>
+          <w:p>
+            <w:pPr>
+              <w:spacing w:after="0" w:line="360" w:lineRule="auto"/>
+              <w:jc w:val="both"/>
+              <w:rPr/>
+            </w:pPr>
+            <w:r>
+              <w:rPr>
+                <w:rFonts w:ascii="Courier New" w:cs="Courier New" w:eastAsia="Courier New" w:hAnsi="Courier New"/>
+                <w:sz w:val="18"/>
+                <w:szCs w:val="18"/>
+                <w:rtl w:val="0"/>
+              </w:rPr>
+              <w:t xml:space="preserve">    scaled = apply_standardizer(filled, stats)</w:t>
+            </w:r>
+            <w:r>
+              <w:rPr>
+                <w:rtl w:val="0"/>
+              </w:rPr>
+            </w:r>
+          </w:p>
+          <w:p>
+            <w:pPr>
+              <w:spacing w:after="0" w:line="360" w:lineRule="auto"/>
+              <w:jc w:val="both"/>
+              <w:rPr/>
+            </w:pPr>
+            <w:r>
+              <w:rPr>
+                <w:rFonts w:ascii="Courier New" w:cs="Courier New" w:eastAsia="Courier New" w:hAnsi="Courier New"/>
+                <w:sz w:val="18"/>
+                <w:szCs w:val="18"/>
+                <w:rtl w:val="0"/>
+              </w:rPr>
+            </w:r>
+            <w:r>
+              <w:rPr>
+                <w:rtl w:val="0"/>
+              </w:rPr>
+            </w:r>
+          </w:p>
+          <w:p>
+            <w:pPr>
+              <w:spacing w:after="0" w:line="360" w:lineRule="auto"/>
+              <w:jc w:val="both"/>
+              <w:rPr/>
+            </w:pPr>
+            <w:r>
+              <w:rPr>
+                <w:rFonts w:ascii="Courier New" w:cs="Courier New" w:eastAsia="Courier New" w:hAnsi="Courier New"/>
+                <w:sz w:val="18"/>
+                <w:szCs w:val="18"/>
+                <w:rtl w:val="0"/>
+              </w:rPr>
+              <w:t xml:space="preserve">    examples = [</w:t>
+            </w:r>
+            <w:r>
+              <w:rPr>
+                <w:rtl w:val="0"/>
+              </w:rPr>
+            </w:r>
+          </w:p>
+          <w:p>
+            <w:pPr>
+              <w:spacing w:after="0" w:line="360" w:lineRule="auto"/>
+              <w:jc w:val="both"/>
+              <w:rPr/>
+            </w:pPr>
+            <w:r>
+              <w:rPr>
+                <w:rFonts w:ascii="Courier New" w:cs="Courier New" w:eastAsia="Courier New" w:hAnsi="Courier New"/>
+                <w:sz w:val="18"/>
+                <w:szCs w:val="18"/>
+                <w:rtl w:val="0"/>
+              </w:rPr>
+              <w:t xml:space="preserve">        (_to_vector(row, feature_names), _label(original))</w:t>
+            </w:r>
+            <w:r>
+              <w:rPr>
+                <w:rtl w:val="0"/>
+              </w:rPr>
+            </w:r>
+          </w:p>
+          <w:p>
+            <w:pPr>
+              <w:spacing w:after="0" w:line="360" w:lineRule="auto"/>
+              <w:jc w:val="both"/>
+              <w:rPr/>
+            </w:pPr>
+            <w:r>
+              <w:rPr>
+                <w:rFonts w:ascii="Courier New" w:cs="Courier New" w:eastAsia="Courier New" w:hAnsi="Courier New"/>
+                <w:sz w:val="18"/>
+                <w:szCs w:val="18"/>
+                <w:rtl w:val="0"/>
+              </w:rPr>
+              <w:t xml:space="preserve">        for row, original in zip(scaled, rows, strict=True)</w:t>
+            </w:r>
+            <w:r>
+              <w:rPr>
+                <w:rtl w:val="0"/>
+              </w:rPr>
+            </w:r>
+          </w:p>
+          <w:p>
+            <w:pPr>
+              <w:spacing w:after="0" w:line="360" w:lineRule="auto"/>
+              <w:jc w:val="both"/>
+              <w:rPr/>
+            </w:pPr>
+            <w:r>
+              <w:rPr>
+                <w:rFonts w:ascii="Courier New" w:cs="Courier New" w:eastAsia="Courier New" w:hAnsi="Courier New"/>
+                <w:sz w:val="18"/>
+                <w:szCs w:val="18"/>
+                <w:rtl w:val="0"/>
+              </w:rPr>
+              <w:t xml:space="preserve">    ]</w:t>
+            </w:r>
+            <w:r>
+              <w:rPr>
+                <w:rtl w:val="0"/>
+              </w:rPr>
+            </w:r>
+          </w:p>
+          <w:p>
+            <w:pPr>
+              <w:spacing w:after="0" w:line="360" w:lineRule="auto"/>
+              <w:jc w:val="both"/>
+              <w:rPr/>
+            </w:pPr>
+            <w:r>
+              <w:rPr>
+                <w:rFonts w:ascii="Courier New" w:cs="Courier New" w:eastAsia="Courier New" w:hAnsi="Courier New"/>
+                <w:sz w:val="18"/>
+                <w:szCs w:val="18"/>
+                <w:rtl w:val="0"/>
+              </w:rPr>
+            </w:r>
+            <w:r>
+              <w:rPr>
+                <w:rtl w:val="0"/>
+              </w:rPr>
+            </w:r>
+          </w:p>
+          <w:p>
+            <w:pPr>
+              <w:spacing w:after="0" w:line="360" w:lineRule="auto"/>
+              <w:jc w:val="both"/>
+              <w:rPr/>
+            </w:pPr>
+            <w:r>
+              <w:rPr>
+                <w:rFonts w:ascii="Courier New" w:cs="Courier New" w:eastAsia="Courier New" w:hAnsi="Courier New"/>
+                <w:sz w:val="18"/>
+                <w:szCs w:val="18"/>
+                <w:rtl w:val="0"/>
+              </w:rPr>
+              <w:t xml:space="preserve">    random.shuffle(examples)</w:t>
+            </w:r>
+            <w:r>
+              <w:rPr>
+                <w:rtl w:val="0"/>
+              </w:rPr>
+            </w:r>
+          </w:p>
+          <w:p>
+            <w:pPr>
+              <w:spacing w:after="0" w:line="360" w:lineRule="auto"/>
+              <w:jc w:val="both"/>
+              <w:rPr/>
+            </w:pPr>
+            <w:r>
+              <w:rPr>
+                <w:rFonts w:ascii="Courier New" w:cs="Courier New" w:eastAsia="Courier New" w:hAnsi="Courier New"/>
+                <w:sz w:val="18"/>
+                <w:szCs w:val="18"/>
+                <w:rtl w:val="0"/>
+              </w:rPr>
+              <w:t xml:space="preserve">    cut = int(len(examples) * (1 - TEST_FRACTION))</w:t>
+            </w:r>
+            <w:r>
+              <w:rPr>
+                <w:rtl w:val="0"/>
+              </w:rPr>
+            </w:r>
+          </w:p>
+          <w:p>
+            <w:pPr>
+              <w:spacing w:after="0" w:line="360" w:lineRule="auto"/>
+              <w:jc w:val="both"/>
+              <w:rPr/>
+            </w:pPr>
+            <w:r>
+              <w:rPr>
+                <w:rFonts w:ascii="Courier New" w:cs="Courier New" w:eastAsia="Courier New" w:hAnsi="Courier New"/>
+                <w:sz w:val="18"/>
+                <w:szCs w:val="18"/>
+                <w:rtl w:val="0"/>
+              </w:rPr>
+              <w:t xml:space="preserve">    train, test = examples[:cut], examples[cut:]</w:t>
+            </w:r>
+            <w:r>
+              <w:rPr>
+                <w:rtl w:val="0"/>
+              </w:rPr>
+            </w:r>
+          </w:p>
+          <w:p>
+            <w:pPr>
+              <w:spacing w:after="0" w:line="360" w:lineRule="auto"/>
+              <w:jc w:val="both"/>
+              <w:rPr/>
+            </w:pPr>
+            <w:r>
+              <w:rPr>
+                <w:rFonts w:ascii="Courier New" w:cs="Courier New" w:eastAsia="Courier New" w:hAnsi="Courier New"/>
+                <w:sz w:val="18"/>
+                <w:szCs w:val="18"/>
+                <w:rtl w:val="0"/>
+              </w:rPr>
+            </w:r>
+            <w:r>
+              <w:rPr>
+                <w:rtl w:val="0"/>
+              </w:rPr>
+            </w:r>
+          </w:p>
+          <w:p>
+            <w:pPr>
+              <w:spacing w:after="0" w:line="360" w:lineRule="auto"/>
+              <w:jc w:val="both"/>
+              <w:rPr/>
+            </w:pPr>
+            <w:r>
+              <w:rPr>
+                <w:rFonts w:ascii="Courier New" w:cs="Courier New" w:eastAsia="Courier New" w:hAnsi="Courier New"/>
+                <w:sz w:val="18"/>
+                <w:szCs w:val="18"/>
+                <w:rtl w:val="0"/>
+              </w:rPr>
+              <w:t xml:space="preserve">    return TrainingSets(</w:t>
+            </w:r>
+            <w:r>
+              <w:rPr>
+                <w:rtl w:val="0"/>
+              </w:rPr>
+            </w:r>
+          </w:p>
+          <w:p>
+            <w:pPr>
+              <w:spacing w:after="0" w:line="360" w:lineRule="auto"/>
+              <w:jc w:val="both"/>
+              <w:rPr/>
+            </w:pPr>
+            <w:r>
+              <w:rPr>
+                <w:rFonts w:ascii="Courier New" w:cs="Courier New" w:eastAsia="Courier New" w:hAnsi="Courier New"/>
+                <w:sz w:val="18"/>
+                <w:szCs w:val="18"/>
+                <w:rtl w:val="0"/>
+              </w:rPr>
+              <w:t xml:space="preserve">        feature_names=feature_names,</w:t>
+            </w:r>
+            <w:r>
+              <w:rPr>
+                <w:rtl w:val="0"/>
+              </w:rPr>
+            </w:r>
+          </w:p>
+          <w:p>
+            <w:pPr>
+              <w:spacing w:after="0" w:line="360" w:lineRule="auto"/>
+              <w:jc w:val="both"/>
+              <w:rPr/>
+            </w:pPr>
+            <w:r>
+              <w:rPr>
+                <w:rFonts w:ascii="Courier New" w:cs="Courier New" w:eastAsia="Courier New" w:hAnsi="Courier New"/>
+                <w:sz w:val="18"/>
+                <w:szCs w:val="18"/>
+                <w:rtl w:val="0"/>
+              </w:rPr>
+              <w:t xml:space="preserve">        train_features=[features for features, _ in train],</w:t>
+            </w:r>
+            <w:r>
+              <w:rPr>
+                <w:rtl w:val="0"/>
+              </w:rPr>
+            </w:r>
+          </w:p>
+          <w:p>
+            <w:pPr>
+              <w:spacing w:after="0" w:line="360" w:lineRule="auto"/>
+              <w:jc w:val="both"/>
+              <w:rPr/>
+            </w:pPr>
+            <w:r>
+              <w:rPr>
+                <w:rFonts w:ascii="Courier New" w:cs="Courier New" w:eastAsia="Courier New" w:hAnsi="Courier New"/>
+                <w:sz w:val="18"/>
+                <w:szCs w:val="18"/>
+                <w:rtl w:val="0"/>
+              </w:rPr>
+              <w:t xml:space="preserve">        train_labels=[label for _, label in train],</w:t>
+            </w:r>
+            <w:r>
+              <w:rPr>
+                <w:rtl w:val="0"/>
+              </w:rPr>
+            </w:r>
+          </w:p>
+          <w:p>
+            <w:pPr>
+              <w:spacing w:after="0" w:line="360" w:lineRule="auto"/>
+              <w:jc w:val="both"/>
+              <w:rPr/>
+            </w:pPr>
+            <w:r>
+              <w:rPr>
+                <w:rFonts w:ascii="Courier New" w:cs="Courier New" w:eastAsia="Courier New" w:hAnsi="Courier New"/>
+                <w:sz w:val="18"/>
+                <w:szCs w:val="18"/>
+                <w:rtl w:val="0"/>
+              </w:rPr>
+              <w:t xml:space="preserve">        test_features=[features for features, _ in test],</w:t>
+            </w:r>
+            <w:r>
+              <w:rPr>
+                <w:rtl w:val="0"/>
+              </w:rPr>
+            </w:r>
+          </w:p>
+          <w:p>
+            <w:pPr>
+              <w:spacing w:after="0" w:line="360" w:lineRule="auto"/>
+              <w:jc w:val="both"/>
+              <w:rPr/>
+            </w:pPr>
+            <w:r>
+              <w:rPr>
+                <w:rFonts w:ascii="Courier New" w:cs="Courier New" w:eastAsia="Courier New" w:hAnsi="Courier New"/>
+                <w:sz w:val="18"/>
+                <w:szCs w:val="18"/>
+                <w:rtl w:val="0"/>
+              </w:rPr>
+              <w:t xml:space="preserve">        test_labels=[label for _, label in test],</w:t>
+            </w:r>
+            <w:r>
+              <w:rPr>
+                <w:rtl w:val="0"/>
+              </w:rPr>
+            </w:r>
+          </w:p>
+          <w:p>
+            <w:pPr>
+              <w:spacing w:after="0" w:line="360" w:lineRule="auto"/>
+              <w:jc w:val="both"/>
+              <w:rPr/>
+            </w:pPr>
+            <w:r>
+              <w:rPr>
+                <w:rFonts w:ascii="Courier New" w:cs="Courier New" w:eastAsia="Courier New" w:hAnsi="Courier New"/>
+                <w:sz w:val="18"/>
+                <w:szCs w:val="18"/>
+                <w:rtl w:val="0"/>
+              </w:rPr>
+              <w:t xml:space="preserve">    )</w:t>
+            </w:r>
+            <w:r>
+              <w:rPr>
+                <w:rtl w:val="0"/>
+              </w:rPr>
+            </w:r>
+          </w:p>
+          <w:p>
+            <w:pPr>
+              <w:spacing w:after="0" w:line="360" w:lineRule="auto"/>
+              <w:jc w:val="both"/>
+              <w:rPr/>
+            </w:pPr>
+            <w:r>
+              <w:rPr>
+                <w:rFonts w:ascii="Courier New" w:cs="Courier New" w:eastAsia="Courier New" w:hAnsi="Courier New"/>
+                <w:sz w:val="18"/>
+                <w:szCs w:val="18"/>
+                <w:rtl w:val="0"/>
+              </w:rPr>
+            </w:r>
+            <w:r>
+              <w:rPr>
+                <w:rtl w:val="0"/>
+              </w:rPr>
+            </w:r>
+          </w:p>
+          <w:p>
+            <w:pPr>
+              <w:spacing w:after="0" w:line="360" w:lineRule="auto"/>
+              <w:jc w:val="both"/>
+              <w:rPr/>
+            </w:pPr>
+            <w:r>
+              <w:rPr>
+                <w:rFonts w:ascii="Courier New" w:cs="Courier New" w:eastAsia="Courier New" w:hAnsi="Courier New"/>
+                <w:sz w:val="18"/>
+                <w:szCs w:val="18"/>
+                <w:rtl w:val="0"/>
+              </w:rPr>
             </w:r>
             <w:r>
               <w:rPr>
@@ -9902,7 +9967,7 @@
                 <w:szCs w:val="18"/>
                 <w:rtl w:val="0"/>
               </w:rPr>
-              <w:t xml:space="preserve">    return {name: 0.0 if value is None else value for name, value in row.items()}</w:t>
+              <w:t xml:space="preserve">    return {name: 0.0 if value is None else value for name, value in row.items()}</w:t>
             </w:r>
             <w:r>
               <w:rPr>
@@ -10266,70 +10331,70 @@
                 <w:szCs w:val="18"/>
                 <w:rtl w:val="0"/>
               </w:rPr>
-              <w:t xml:space="preserve">  "how" questions about how something works - data loading, train/test</w:t>
-            </w:r>
-            <w:r>
-              <w:rPr>
-                <w:rtl w:val="0"/>
-              </w:rPr>
-            </w:r>
-          </w:p>
-          <w:p>
-            <w:pPr>
-              <w:spacing w:after="0" w:line="360" w:lineRule="auto"/>
-              <w:jc w:val="both"/>
-              <w:rPr/>
-            </w:pPr>
-            <w:r>
-              <w:rPr>
-                <w:rFonts w:ascii="Courier New" w:cs="Courier New" w:eastAsia="Courier New" w:hAnsi="Courier New"/>
-                <w:sz w:val="18"/>
-                <w:szCs w:val="18"/>
-                <w:rtl w:val="0"/>
-              </w:rPr>
-              <w:t xml:space="preserve">  splitting, feature scaling, configuration. Use when the user needs</w:t>
-            </w:r>
-            <w:r>
-              <w:rPr>
-                <w:rtl w:val="0"/>
-              </w:rPr>
-            </w:r>
-          </w:p>
-          <w:p>
-            <w:pPr>
-              <w:spacing w:after="0" w:line="360" w:lineRule="auto"/>
-              <w:jc w:val="both"/>
-              <w:rPr/>
-            </w:pPr>
-            <w:r>
-              <w:rPr>
-                <w:rFonts w:ascii="Courier New" w:cs="Courier New" w:eastAsia="Courier New" w:hAnsi="Courier New"/>
-                <w:sz w:val="18"/>
-                <w:szCs w:val="18"/>
-                <w:rtl w:val="0"/>
-              </w:rPr>
-              <w:t xml:space="preserve">  to locate logic or understand a flow without reading every file</w:t>
-            </w:r>
-            <w:r>
-              <w:rPr>
-                <w:rtl w:val="0"/>
-              </w:rPr>
-            </w:r>
-          </w:p>
-          <w:p>
-            <w:pPr>
-              <w:spacing w:after="0" w:line="360" w:lineRule="auto"/>
-              <w:jc w:val="both"/>
-              <w:rPr/>
-            </w:pPr>
-            <w:r>
-              <w:rPr>
-                <w:rFonts w:ascii="Courier New" w:cs="Courier New" w:eastAsia="Courier New" w:hAnsi="Courier New"/>
-                <w:sz w:val="18"/>
-                <w:szCs w:val="18"/>
-                <w:rtl w:val="0"/>
-              </w:rPr>
-              <w:t xml:space="preserve">  themselves. Return precise file paths and line numbers.</w:t>
+              <w:t xml:space="preserve">  "how" questions about how something works - data loading, train/test</w:t>
+            </w:r>
+            <w:r>
+              <w:rPr>
+                <w:rtl w:val="0"/>
+              </w:rPr>
+            </w:r>
+          </w:p>
+          <w:p>
+            <w:pPr>
+              <w:spacing w:after="0" w:line="360" w:lineRule="auto"/>
+              <w:jc w:val="both"/>
+              <w:rPr/>
+            </w:pPr>
+            <w:r>
+              <w:rPr>
+                <w:rFonts w:ascii="Courier New" w:cs="Courier New" w:eastAsia="Courier New" w:hAnsi="Courier New"/>
+                <w:sz w:val="18"/>
+                <w:szCs w:val="18"/>
+                <w:rtl w:val="0"/>
+              </w:rPr>
+              <w:t xml:space="preserve">  splitting, feature scaling, configuration. Use when the user needs</w:t>
+            </w:r>
+            <w:r>
+              <w:rPr>
+                <w:rtl w:val="0"/>
+              </w:rPr>
+            </w:r>
+          </w:p>
+          <w:p>
+            <w:pPr>
+              <w:spacing w:after="0" w:line="360" w:lineRule="auto"/>
+              <w:jc w:val="both"/>
+              <w:rPr/>
+            </w:pPr>
+            <w:r>
+              <w:rPr>
+                <w:rFonts w:ascii="Courier New" w:cs="Courier New" w:eastAsia="Courier New" w:hAnsi="Courier New"/>
+                <w:sz w:val="18"/>
+                <w:szCs w:val="18"/>
+                <w:rtl w:val="0"/>
+              </w:rPr>
+              <w:t xml:space="preserve">  to locate logic or understand a flow without reading every file</w:t>
+            </w:r>
+            <w:r>
+              <w:rPr>
+                <w:rtl w:val="0"/>
+              </w:rPr>
+            </w:r>
+          </w:p>
+          <w:p>
+            <w:pPr>
+              <w:spacing w:after="0" w:line="360" w:lineRule="auto"/>
+              <w:jc w:val="both"/>
+              <w:rPr/>
+            </w:pPr>
+            <w:r>
+              <w:rPr>
+                <w:rFonts w:ascii="Courier New" w:cs="Courier New" w:eastAsia="Courier New" w:hAnsi="Courier New"/>
+                <w:sz w:val="18"/>
+                <w:szCs w:val="18"/>
+                <w:rtl w:val="0"/>
+              </w:rPr>
+              <w:t xml:space="preserve">  themselves. Return precise file paths and line numbers.</w:t>
             </w:r>
             <w:r>
               <w:rPr>
@@ -10518,7 +10583,6 @@
                 <w:szCs w:val="18"/>
                 <w:rtl w:val="0"/>
               </w:rPr>
-              <w:t xml:space="preserve"> </w:t>
             </w:r>
             <w:r>
               <w:rPr>
@@ -10623,91 +10687,90 @@
                 <w:szCs w:val="18"/>
                 <w:rtl w:val="0"/>
               </w:rPr>
-              <w:t xml:space="preserve">   - Answer - one or two sentences stating where the logic lives and how</w:t>
-            </w:r>
-            <w:r>
-              <w:rPr>
-                <w:rtl w:val="0"/>
-              </w:rPr>
-            </w:r>
-          </w:p>
-          <w:p>
-            <w:pPr>
-              <w:spacing w:after="0" w:line="360" w:lineRule="auto"/>
-              <w:jc w:val="both"/>
-              <w:rPr/>
-            </w:pPr>
-            <w:r>
-              <w:rPr>
-                <w:rFonts w:ascii="Courier New" w:cs="Courier New" w:eastAsia="Courier New" w:hAnsi="Courier New"/>
-                <w:sz w:val="18"/>
-                <w:szCs w:val="18"/>
-                <w:rtl w:val="0"/>
-              </w:rPr>
-              <w:t xml:space="preserve">     it works.</w:t>
-            </w:r>
-            <w:r>
-              <w:rPr>
-                <w:rtl w:val="0"/>
-              </w:rPr>
-            </w:r>
-          </w:p>
-          <w:p>
-            <w:pPr>
-              <w:spacing w:after="0" w:line="360" w:lineRule="auto"/>
-              <w:jc w:val="both"/>
-              <w:rPr/>
-            </w:pPr>
-            <w:r>
-              <w:rPr>
-                <w:rFonts w:ascii="Courier New" w:cs="Courier New" w:eastAsia="Courier New" w:hAnsi="Courier New"/>
-                <w:sz w:val="18"/>
-                <w:szCs w:val="18"/>
-                <w:rtl w:val="0"/>
-              </w:rPr>
-              <w:t xml:space="preserve">   - Key locations - file path and line number for each important point.</w:t>
-            </w:r>
-            <w:r>
-              <w:rPr>
-                <w:rtl w:val="0"/>
-              </w:rPr>
-            </w:r>
-          </w:p>
-          <w:p>
-            <w:pPr>
-              <w:spacing w:after="0" w:line="360" w:lineRule="auto"/>
-              <w:jc w:val="both"/>
-              <w:rPr/>
-            </w:pPr>
-            <w:r>
-              <w:rPr>
-                <w:rFonts w:ascii="Courier New" w:cs="Courier New" w:eastAsia="Courier New" w:hAnsi="Courier New"/>
-                <w:sz w:val="18"/>
-                <w:szCs w:val="18"/>
-                <w:rtl w:val="0"/>
-              </w:rPr>
-              <w:t xml:space="preserve">   - Notes - anything the caller should know (assumptions, gaps).</w:t>
-            </w:r>
-            <w:r>
-              <w:rPr>
-                <w:rtl w:val="0"/>
-              </w:rPr>
-            </w:r>
-          </w:p>
-          <w:p>
-            <w:pPr>
-              <w:spacing w:after="0" w:line="360" w:lineRule="auto"/>
-              <w:jc w:val="both"/>
-              <w:rPr/>
-            </w:pPr>
-            <w:r>
-              <w:rPr>
-                <w:rFonts w:ascii="Courier New" w:cs="Courier New" w:eastAsia="Courier New" w:hAnsi="Courier New"/>
-                <w:sz w:val="18"/>
-                <w:szCs w:val="18"/>
-                <w:rtl w:val="0"/>
-              </w:rPr>
-              <w:t xml:space="preserve"> </w:t>
+              <w:t xml:space="preserve">   - Answer - one or two sentences stating where the logic lives and how</w:t>
+            </w:r>
+            <w:r>
+              <w:rPr>
+                <w:rtl w:val="0"/>
+              </w:rPr>
+            </w:r>
+          </w:p>
+          <w:p>
+            <w:pPr>
+              <w:spacing w:after="0" w:line="360" w:lineRule="auto"/>
+              <w:jc w:val="both"/>
+              <w:rPr/>
+            </w:pPr>
+            <w:r>
+              <w:rPr>
+                <w:rFonts w:ascii="Courier New" w:cs="Courier New" w:eastAsia="Courier New" w:hAnsi="Courier New"/>
+                <w:sz w:val="18"/>
+                <w:szCs w:val="18"/>
+                <w:rtl w:val="0"/>
+              </w:rPr>
+              <w:t xml:space="preserve">     it works.</w:t>
+            </w:r>
+            <w:r>
+              <w:rPr>
+                <w:rtl w:val="0"/>
+              </w:rPr>
+            </w:r>
+          </w:p>
+          <w:p>
+            <w:pPr>
+              <w:spacing w:after="0" w:line="360" w:lineRule="auto"/>
+              <w:jc w:val="both"/>
+              <w:rPr/>
+            </w:pPr>
+            <w:r>
+              <w:rPr>
+                <w:rFonts w:ascii="Courier New" w:cs="Courier New" w:eastAsia="Courier New" w:hAnsi="Courier New"/>
+                <w:sz w:val="18"/>
+                <w:szCs w:val="18"/>
+                <w:rtl w:val="0"/>
+              </w:rPr>
+              <w:t xml:space="preserve">   - Key locations - file path and line number for each important point.</w:t>
+            </w:r>
+            <w:r>
+              <w:rPr>
+                <w:rtl w:val="0"/>
+              </w:rPr>
+            </w:r>
+          </w:p>
+          <w:p>
+            <w:pPr>
+              <w:spacing w:after="0" w:line="360" w:lineRule="auto"/>
+              <w:jc w:val="both"/>
+              <w:rPr/>
+            </w:pPr>
+            <w:r>
+              <w:rPr>
+                <w:rFonts w:ascii="Courier New" w:cs="Courier New" w:eastAsia="Courier New" w:hAnsi="Courier New"/>
+                <w:sz w:val="18"/>
+                <w:szCs w:val="18"/>
+                <w:rtl w:val="0"/>
+              </w:rPr>
+              <w:t xml:space="preserve">   - Notes - anything the caller should know (assumptions, gaps).</w:t>
+            </w:r>
+            <w:r>
+              <w:rPr>
+                <w:rtl w:val="0"/>
+              </w:rPr>
+            </w:r>
+          </w:p>
+          <w:p>
+            <w:pPr>
+              <w:spacing w:after="0" w:line="360" w:lineRule="auto"/>
+              <w:jc w:val="both"/>
+              <w:rPr/>
+            </w:pPr>
+            <w:r>
+              <w:rPr>
+                <w:rFonts w:ascii="Courier New" w:cs="Courier New" w:eastAsia="Courier New" w:hAnsi="Courier New"/>
+                <w:sz w:val="18"/>
+                <w:szCs w:val="18"/>
+                <w:rtl w:val="0"/>
+              </w:rPr>
             </w:r>
             <w:r>
               <w:rPr>
@@ -10951,70 +11014,70 @@
                 <w:szCs w:val="18"/>
                 <w:rtl w:val="0"/>
               </w:rPr>
-              <w:t xml:space="preserve">  preparation, and train/test splitting - for data leakage,</w:t>
-            </w:r>
-            <w:r>
-              <w:rPr>
-                <w:rtl w:val="0"/>
-              </w:rPr>
-            </w:r>
-          </w:p>
-          <w:p>
-            <w:pPr>
-              <w:spacing w:after="0" w:line="360" w:lineRule="auto"/>
-              <w:jc w:val="both"/>
-              <w:rPr/>
-            </w:pPr>
-            <w:r>
-              <w:rPr>
-                <w:rFonts w:ascii="Courier New" w:cs="Courier New" w:eastAsia="Courier New" w:hAnsi="Courier New"/>
-                <w:sz w:val="18"/>
-                <w:szCs w:val="18"/>
-                <w:rtl w:val="0"/>
-              </w:rPr>
-              <w:t xml:space="preserve">  reproducibility, and correctness. Use after writing or modifying</w:t>
-            </w:r>
-            <w:r>
-              <w:rPr>
-                <w:rtl w:val="0"/>
-              </w:rPr>
-            </w:r>
-          </w:p>
-          <w:p>
-            <w:pPr>
-              <w:spacing w:after="0" w:line="360" w:lineRule="auto"/>
-              <w:jc w:val="both"/>
-              <w:rPr/>
-            </w:pPr>
-            <w:r>
-              <w:rPr>
-                <w:rFonts w:ascii="Courier New" w:cs="Courier New" w:eastAsia="Courier New" w:hAnsi="Courier New"/>
-                <w:sz w:val="18"/>
-                <w:szCs w:val="18"/>
-                <w:rtl w:val="0"/>
-              </w:rPr>
-              <w:t xml:space="preserve">  pipeline, feature, or training code. You must tell the agent</w:t>
-            </w:r>
-            <w:r>
-              <w:rPr>
-                <w:rtl w:val="0"/>
-              </w:rPr>
-            </w:r>
-          </w:p>
-          <w:p>
-            <w:pPr>
-              <w:spacing w:after="0" w:line="360" w:lineRule="auto"/>
-              <w:jc w:val="both"/>
-              <w:rPr/>
-            </w:pPr>
-            <w:r>
-              <w:rPr>
-                <w:rFonts w:ascii="Courier New" w:cs="Courier New" w:eastAsia="Courier New" w:hAnsi="Courier New"/>
-                <w:sz w:val="18"/>
-                <w:szCs w:val="18"/>
-                <w:rtl w:val="0"/>
-              </w:rPr>
-              <w:t xml:space="preserve">  precisely which files to review.</w:t>
+              <w:t xml:space="preserve">  preparation, and train/test splitting - for data leakage,</w:t>
+            </w:r>
+            <w:r>
+              <w:rPr>
+                <w:rtl w:val="0"/>
+              </w:rPr>
+            </w:r>
+          </w:p>
+          <w:p>
+            <w:pPr>
+              <w:spacing w:after="0" w:line="360" w:lineRule="auto"/>
+              <w:jc w:val="both"/>
+              <w:rPr/>
+            </w:pPr>
+            <w:r>
+              <w:rPr>
+                <w:rFonts w:ascii="Courier New" w:cs="Courier New" w:eastAsia="Courier New" w:hAnsi="Courier New"/>
+                <w:sz w:val="18"/>
+                <w:szCs w:val="18"/>
+                <w:rtl w:val="0"/>
+              </w:rPr>
+              <w:t xml:space="preserve">  reproducibility, and correctness. Use after writing or modifying</w:t>
+            </w:r>
+            <w:r>
+              <w:rPr>
+                <w:rtl w:val="0"/>
+              </w:rPr>
+            </w:r>
+          </w:p>
+          <w:p>
+            <w:pPr>
+              <w:spacing w:after="0" w:line="360" w:lineRule="auto"/>
+              <w:jc w:val="both"/>
+              <w:rPr/>
+            </w:pPr>
+            <w:r>
+              <w:rPr>
+                <w:rFonts w:ascii="Courier New" w:cs="Courier New" w:eastAsia="Courier New" w:hAnsi="Courier New"/>
+                <w:sz w:val="18"/>
+                <w:szCs w:val="18"/>
+                <w:rtl w:val="0"/>
+              </w:rPr>
+              <w:t xml:space="preserve">  pipeline, feature, or training code. You must tell the agent</w:t>
+            </w:r>
+            <w:r>
+              <w:rPr>
+                <w:rtl w:val="0"/>
+              </w:rPr>
+            </w:r>
+          </w:p>
+          <w:p>
+            <w:pPr>
+              <w:spacing w:after="0" w:line="360" w:lineRule="auto"/>
+              <w:jc w:val="both"/>
+              <w:rPr/>
+            </w:pPr>
+            <w:r>
+              <w:rPr>
+                <w:rFonts w:ascii="Courier New" w:cs="Courier New" w:eastAsia="Courier New" w:hAnsi="Courier New"/>
+                <w:sz w:val="18"/>
+                <w:szCs w:val="18"/>
+                <w:rtl w:val="0"/>
+              </w:rPr>
+              <w:t xml:space="preserve">  precisely which files to review.</w:t>
             </w:r>
             <w:r>
               <w:rPr>
@@ -11182,7 +11245,6 @@
                 <w:szCs w:val="18"/>
                 <w:rtl w:val="0"/>
               </w:rPr>
-              <w:t xml:space="preserve"> </w:t>
             </w:r>
             <w:r>
               <w:rPr>
@@ -11245,7 +11307,7 @@
                 <w:szCs w:val="18"/>
                 <w:rtl w:val="0"/>
               </w:rPr>
-              <w:t xml:space="preserve">  model feature.</w:t>
+              <w:t xml:space="preserve">  model feature.</w:t>
             </w:r>
             <w:r>
               <w:rPr>
@@ -11287,7 +11349,7 @@
                 <w:szCs w:val="18"/>
                 <w:rtl w:val="0"/>
               </w:rPr>
-              <w:t xml:space="preserve">  vocabularies fitted on data that includes the test set.</w:t>
+              <w:t xml:space="preserve">  vocabularies fitted on data that includes the test set.</w:t>
             </w:r>
             <w:r>
               <w:rPr>
@@ -11329,7 +11391,7 @@
                 <w:szCs w:val="18"/>
                 <w:rtl w:val="0"/>
               </w:rPr>
-              <w:t xml:space="preserve">  change from run to run.</w:t>
+              <w:t xml:space="preserve">  change from run to run.</w:t>
             </w:r>
             <w:r>
               <w:rPr>
@@ -11392,7 +11454,6 @@
                 <w:szCs w:val="18"/>
                 <w:rtl w:val="0"/>
               </w:rPr>
-              <w:t xml:space="preserve"> </w:t>
             </w:r>
             <w:r>
               <w:rPr>
@@ -11560,7 +11621,7 @@
                 <w:szCs w:val="18"/>
                 <w:rtl w:val="0"/>
               </w:rPr>
-              <w:t xml:space="preserve">   the review.</w:t>
+              <w:t xml:space="preserve">   the review.</w:t>
             </w:r>
             <w:r>
               <w:rPr>
@@ -11609,7 +11670,7 @@
         <w:rPr>
           <w:rtl w:val="0"/>
         </w:rPr>
-        <w:t xml:space="preserve"> The reviewer reads and searches the code you point it at, but has no Edit or Write access - it reviews, it does not change.</w:t>
+        <w:t xml:space="preserve"> The reviewer reads and searches the code you point it at, but has no Edit or Write access - it reviews, it does not change. The tool table in section 06 of the lesson adds Bash for reviewers so they can run git diff; this one does not need it, because you tell it exactly which file to review.</w:t>
       </w:r>
     </w:p>
     <w:p>
@@ -12548,28 +12609,28 @@
                 <w:szCs w:val="18"/>
                 <w:rtl w:val="0"/>
               </w:rPr>
-              <w:t xml:space="preserve">  pipeline modules in the team's standard format. Use when a new</w:t>
-            </w:r>
-            <w:r>
-              <w:rPr>
-                <w:rtl w:val="0"/>
-              </w:rPr>
-            </w:r>
-          </w:p>
-          <w:p>
-            <w:pPr>
-              <w:spacing w:after="0" w:line="360" w:lineRule="auto"/>
-              <w:jc w:val="both"/>
-              <w:rPr/>
-            </w:pPr>
-            <w:r>
-              <w:rPr>
-                <w:rFonts w:ascii="Courier New" w:cs="Courier New" w:eastAsia="Courier New" w:hAnsi="Courier New"/>
-                <w:sz w:val="18"/>
-                <w:szCs w:val="18"/>
-                <w:rtl w:val="0"/>
-              </w:rPr>
-              <w:t xml:space="preserve">  pipeline module is ready and needs developer-facing docs.</w:t>
+              <w:t xml:space="preserve">  pipeline modules in the team's standard format. Use when a new</w:t>
+            </w:r>
+            <w:r>
+              <w:rPr>
+                <w:rtl w:val="0"/>
+              </w:rPr>
+            </w:r>
+          </w:p>
+          <w:p>
+            <w:pPr>
+              <w:spacing w:after="0" w:line="360" w:lineRule="auto"/>
+              <w:jc w:val="both"/>
+              <w:rPr/>
+            </w:pPr>
+            <w:r>
+              <w:rPr>
+                <w:rFonts w:ascii="Courier New" w:cs="Courier New" w:eastAsia="Courier New" w:hAnsi="Courier New"/>
+                <w:sz w:val="18"/>
+                <w:szCs w:val="18"/>
+                <w:rtl w:val="0"/>
+              </w:rPr>
+              <w:t xml:space="preserve">  pipeline module is ready and needs developer-facing docs.</w:t>
             </w:r>
             <w:r>
               <w:rPr>
@@ -12737,7 +12798,6 @@
                 <w:szCs w:val="18"/>
                 <w:rtl w:val="0"/>
               </w:rPr>
-              <w:t xml:space="preserve"> </w:t>
             </w:r>
             <w:r>
               <w:rPr>
@@ -12863,28 +12923,27 @@
                 <w:szCs w:val="18"/>
                 <w:rtl w:val="0"/>
               </w:rPr>
-              <w:t xml:space="preserve">  must know before trusting the results.</w:t>
-            </w:r>
-            <w:r>
-              <w:rPr>
-                <w:rtl w:val="0"/>
-              </w:rPr>
-            </w:r>
-          </w:p>
-          <w:p>
-            <w:pPr>
-              <w:spacing w:after="0" w:line="360" w:lineRule="auto"/>
-              <w:jc w:val="both"/>
-              <w:rPr/>
-            </w:pPr>
-            <w:r>
-              <w:rPr>
-                <w:rFonts w:ascii="Courier New" w:cs="Courier New" w:eastAsia="Courier New" w:hAnsi="Courier New"/>
-                <w:sz w:val="18"/>
-                <w:szCs w:val="18"/>
-                <w:rtl w:val="0"/>
-              </w:rPr>
-              <w:t xml:space="preserve"> </w:t>
+              <w:t xml:space="preserve">  must know before trusting the results.</w:t>
+            </w:r>
+            <w:r>
+              <w:rPr>
+                <w:rtl w:val="0"/>
+              </w:rPr>
+            </w:r>
+          </w:p>
+          <w:p>
+            <w:pPr>
+              <w:spacing w:after="0" w:line="360" w:lineRule="auto"/>
+              <w:jc w:val="both"/>
+              <w:rPr/>
+            </w:pPr>
+            <w:r>
+              <w:rPr>
+                <w:rFonts w:ascii="Courier New" w:cs="Courier New" w:eastAsia="Courier New" w:hAnsi="Courier New"/>
+                <w:sz w:val="18"/>
+                <w:szCs w:val="18"/>
+                <w:rtl w:val="0"/>
+              </w:rPr>
             </w:r>
             <w:r>
               <w:rPr>

</xml_diff>